<commit_message>
Add Docker deployment files
</commit_message>
<xml_diff>
--- a/Звіт лаб.docx
+++ b/Звіт лаб.docx
@@ -1021,7 +1021,7 @@
     </w:p>
     <w:tbl>
       <w:tblPr>
-        <w:tblStyle w:val="ab"/>
+        <w:tblStyle w:val="ac"/>
         <w:tblW w:w="9997" w:type="dxa"/>
         <w:tblInd w:w="-34" w:type="dxa"/>
         <w:tblBorders>
@@ -2514,7 +2514,7 @@
     </w:p>
     <w:p>
       <w:pPr>
-        <w:pStyle w:val="a8"/>
+        <w:pStyle w:val="a9"/>
         <w:numPr>
           <w:ilvl w:val="1"/>
           <w:numId w:val="1"/>
@@ -2548,7 +2548,7 @@
     </w:p>
     <w:p>
       <w:pPr>
-        <w:pStyle w:val="a8"/>
+        <w:pStyle w:val="a9"/>
         <w:tabs>
           <w:tab w:val="left" w:pos="0"/>
         </w:tabs>
@@ -2596,7 +2596,7 @@
     </w:p>
     <w:p>
       <w:pPr>
-        <w:pStyle w:val="a8"/>
+        <w:pStyle w:val="a9"/>
         <w:tabs>
           <w:tab w:val="left" w:pos="1276"/>
         </w:tabs>
@@ -2614,7 +2614,7 @@
     </w:p>
     <w:p>
       <w:pPr>
-        <w:pStyle w:val="a8"/>
+        <w:pStyle w:val="a9"/>
         <w:numPr>
           <w:ilvl w:val="1"/>
           <w:numId w:val="1"/>
@@ -2760,7 +2760,7 @@
     </w:p>
     <w:p>
       <w:pPr>
-        <w:pStyle w:val="a8"/>
+        <w:pStyle w:val="a9"/>
         <w:numPr>
           <w:ilvl w:val="1"/>
           <w:numId w:val="1"/>
@@ -2838,7 +2838,7 @@
     </w:p>
     <w:p>
       <w:pPr>
-        <w:pStyle w:val="a8"/>
+        <w:pStyle w:val="a9"/>
         <w:numPr>
           <w:ilvl w:val="1"/>
           <w:numId w:val="1"/>
@@ -2872,7 +2872,7 @@
     </w:p>
     <w:p>
       <w:pPr>
-        <w:pStyle w:val="a8"/>
+        <w:pStyle w:val="a9"/>
         <w:tabs>
           <w:tab w:val="left" w:pos="1276"/>
         </w:tabs>
@@ -3477,7 +3477,7 @@
     </w:p>
     <w:p>
       <w:pPr>
-        <w:pStyle w:val="a8"/>
+        <w:pStyle w:val="a9"/>
         <w:numPr>
           <w:ilvl w:val="1"/>
           <w:numId w:val="10"/>
@@ -3518,7 +3518,7 @@
     </w:p>
     <w:p>
       <w:pPr>
-        <w:pStyle w:val="a8"/>
+        <w:pStyle w:val="a9"/>
         <w:tabs>
           <w:tab w:val="left" w:pos="993"/>
         </w:tabs>
@@ -4624,6 +4624,308 @@
           <w:lang w:val="uk-UA"/>
         </w:rPr>
         <w:t>Вибір технологій зумовлений необхідністю швидкої обробки великих масивів даних (Big Data) та реалізації алгоритмів експертної оцінки:</w:t>
+      </w:r>
+    </w:p>
+    <w:p>
+      <w:pPr>
+        <w:pStyle w:val="ae"/>
+        <w:numPr>
+          <w:ilvl w:val="0"/>
+          <w:numId w:val="39"/>
+        </w:numPr>
+        <w:tabs>
+          <w:tab w:val="clear" w:pos="720"/>
+          <w:tab w:val="num" w:pos="993"/>
+        </w:tabs>
+        <w:ind w:left="0" w:firstLine="709"/>
+      </w:pPr>
+      <w:proofErr w:type="spellStart"/>
+      <w:r>
+        <w:rPr>
+          <w:b/>
+          <w:bCs/>
+        </w:rPr>
+        <w:t>Бекенд</w:t>
+      </w:r>
+      <w:proofErr w:type="spellEnd"/>
+      <w:r>
+        <w:rPr>
+          <w:b/>
+          <w:bCs/>
+        </w:rPr>
+        <w:t xml:space="preserve"> (</w:t>
+      </w:r>
+      <w:proofErr w:type="spellStart"/>
+      <w:r>
+        <w:rPr>
+          <w:b/>
+          <w:bCs/>
+        </w:rPr>
+        <w:t>Backend</w:t>
+      </w:r>
+      <w:proofErr w:type="spellEnd"/>
+      <w:r>
+        <w:rPr>
+          <w:b/>
+          <w:bCs/>
+        </w:rPr>
+        <w:t>):</w:t>
+      </w:r>
+      <w:r>
+        <w:t xml:space="preserve"> </w:t>
+      </w:r>
+      <w:proofErr w:type="spellStart"/>
+      <w:r>
+        <w:t>Python</w:t>
+      </w:r>
+      <w:proofErr w:type="spellEnd"/>
+      <w:r>
+        <w:t xml:space="preserve"> (</w:t>
+      </w:r>
+      <w:proofErr w:type="spellStart"/>
+      <w:r>
+        <w:t>фреймворк</w:t>
+      </w:r>
+      <w:proofErr w:type="spellEnd"/>
+      <w:r>
+        <w:t xml:space="preserve"> </w:t>
+      </w:r>
+      <w:proofErr w:type="spellStart"/>
+      <w:r>
+        <w:t>FastAPI</w:t>
+      </w:r>
+      <w:proofErr w:type="spellEnd"/>
+      <w:r>
+        <w:t xml:space="preserve">). Ця мова дозволяє швидко розгорнути </w:t>
+      </w:r>
+      <w:proofErr w:type="spellStart"/>
+      <w:r>
+        <w:t>бекенд</w:t>
+      </w:r>
+      <w:proofErr w:type="spellEnd"/>
+      <w:r>
+        <w:t xml:space="preserve"> та легко інтегрувати математичні моделі для розрахунку ризиків. Використано </w:t>
+      </w:r>
+      <w:proofErr w:type="spellStart"/>
+      <w:r>
+        <w:rPr>
+          <w:rStyle w:val="HTML"/>
+          <w:rFonts w:ascii="Times New Roman" w:hAnsi="Times New Roman" w:cs="Times New Roman"/>
+          <w:b/>
+          <w:sz w:val="28"/>
+          <w:szCs w:val="28"/>
+        </w:rPr>
+        <w:t>SQLAlchemy</w:t>
+      </w:r>
+      <w:proofErr w:type="spellEnd"/>
+      <w:r>
+        <w:t xml:space="preserve"> як ORM для реляційної бази даних та </w:t>
+      </w:r>
+      <w:proofErr w:type="spellStart"/>
+      <w:r>
+        <w:rPr>
+          <w:rStyle w:val="HTML"/>
+          <w:rFonts w:ascii="Times New Roman" w:hAnsi="Times New Roman" w:cs="Times New Roman"/>
+          <w:b/>
+          <w:sz w:val="28"/>
+          <w:szCs w:val="28"/>
+        </w:rPr>
+        <w:t>Motor</w:t>
+      </w:r>
+      <w:proofErr w:type="spellEnd"/>
+      <w:r>
+        <w:t xml:space="preserve"> для асинхронної роботи з </w:t>
+      </w:r>
+      <w:proofErr w:type="spellStart"/>
+      <w:r>
+        <w:t>MongoDB</w:t>
+      </w:r>
+      <w:proofErr w:type="spellEnd"/>
+      <w:r>
+        <w:t xml:space="preserve">. Для забезпечення безпеки інтегровано бібліотеки </w:t>
+      </w:r>
+      <w:proofErr w:type="spellStart"/>
+      <w:r>
+        <w:rPr>
+          <w:rStyle w:val="HTML"/>
+          <w:rFonts w:ascii="Times New Roman" w:hAnsi="Times New Roman" w:cs="Times New Roman"/>
+          <w:b/>
+          <w:sz w:val="28"/>
+          <w:szCs w:val="28"/>
+        </w:rPr>
+        <w:t>PyJWT</w:t>
+      </w:r>
+      <w:proofErr w:type="spellEnd"/>
+      <w:r>
+        <w:t xml:space="preserve"> (для </w:t>
+      </w:r>
+      <w:proofErr w:type="spellStart"/>
+      <w:r>
+        <w:t>токенів</w:t>
+      </w:r>
+      <w:proofErr w:type="spellEnd"/>
+      <w:r>
+        <w:t xml:space="preserve">), </w:t>
+      </w:r>
+      <w:proofErr w:type="spellStart"/>
+      <w:r>
+        <w:rPr>
+          <w:rStyle w:val="HTML"/>
+          <w:rFonts w:ascii="Times New Roman" w:hAnsi="Times New Roman" w:cs="Times New Roman"/>
+          <w:b/>
+          <w:sz w:val="28"/>
+          <w:szCs w:val="28"/>
+        </w:rPr>
+        <w:t>passlib</w:t>
+      </w:r>
+      <w:proofErr w:type="spellEnd"/>
+      <w:r>
+        <w:t xml:space="preserve"> (для хешування паролів) та </w:t>
+      </w:r>
+      <w:proofErr w:type="spellStart"/>
+      <w:r>
+        <w:rPr>
+          <w:rStyle w:val="HTML"/>
+          <w:rFonts w:ascii="Times New Roman" w:hAnsi="Times New Roman" w:cs="Times New Roman"/>
+          <w:b/>
+          <w:sz w:val="28"/>
+          <w:szCs w:val="28"/>
+        </w:rPr>
+        <w:t>pyotp</w:t>
+      </w:r>
+      <w:proofErr w:type="spellEnd"/>
+      <w:r>
+        <w:t xml:space="preserve"> (для генерації кодів 2FA). </w:t>
+      </w:r>
+    </w:p>
+    <w:p>
+      <w:pPr>
+        <w:pStyle w:val="ae"/>
+        <w:numPr>
+          <w:ilvl w:val="0"/>
+          <w:numId w:val="39"/>
+        </w:numPr>
+        <w:tabs>
+          <w:tab w:val="clear" w:pos="720"/>
+          <w:tab w:val="num" w:pos="993"/>
+        </w:tabs>
+        <w:ind w:left="0" w:firstLine="709"/>
+      </w:pPr>
+      <w:proofErr w:type="spellStart"/>
+      <w:r>
+        <w:rPr>
+          <w:b/>
+          <w:bCs/>
+        </w:rPr>
+        <w:t>Фронтенд</w:t>
+      </w:r>
+      <w:proofErr w:type="spellEnd"/>
+      <w:r>
+        <w:rPr>
+          <w:b/>
+          <w:bCs/>
+        </w:rPr>
+        <w:t xml:space="preserve"> (</w:t>
+      </w:r>
+      <w:proofErr w:type="spellStart"/>
+      <w:r>
+        <w:rPr>
+          <w:b/>
+          <w:bCs/>
+        </w:rPr>
+        <w:t>Frontend</w:t>
+      </w:r>
+      <w:proofErr w:type="spellEnd"/>
+      <w:r>
+        <w:rPr>
+          <w:b/>
+          <w:bCs/>
+        </w:rPr>
+        <w:t>):</w:t>
+      </w:r>
+      <w:r>
+        <w:t xml:space="preserve"> </w:t>
+      </w:r>
+      <w:proofErr w:type="spellStart"/>
+      <w:r>
+        <w:t>React.js</w:t>
+      </w:r>
+      <w:proofErr w:type="spellEnd"/>
+      <w:r>
+        <w:t xml:space="preserve"> 18 у зв'язці зі збирачем </w:t>
+      </w:r>
+      <w:proofErr w:type="spellStart"/>
+      <w:r>
+        <w:t>Vite</w:t>
+      </w:r>
+      <w:proofErr w:type="spellEnd"/>
+      <w:r>
+        <w:t xml:space="preserve"> 6 для максимальної швидкодії. Замість класичного CSS використано </w:t>
+      </w:r>
+      <w:proofErr w:type="spellStart"/>
+      <w:r>
+        <w:rPr>
+          <w:rStyle w:val="HTML"/>
+          <w:rFonts w:ascii="Times New Roman" w:hAnsi="Times New Roman" w:cs="Times New Roman"/>
+          <w:b/>
+          <w:sz w:val="28"/>
+          <w:szCs w:val="28"/>
+        </w:rPr>
+        <w:t>TailwindCSS</w:t>
+      </w:r>
+      <w:proofErr w:type="spellEnd"/>
+      <w:r>
+        <w:rPr>
+          <w:rStyle w:val="HTML"/>
+          <w:rFonts w:ascii="Times New Roman" w:hAnsi="Times New Roman" w:cs="Times New Roman"/>
+          <w:b/>
+          <w:sz w:val="28"/>
+          <w:szCs w:val="28"/>
+        </w:rPr>
+        <w:t xml:space="preserve"> 4</w:t>
+      </w:r>
+      <w:r>
+        <w:t xml:space="preserve"> для швидкої та консистентної стилізації, а також компоненти </w:t>
+      </w:r>
+      <w:proofErr w:type="spellStart"/>
+      <w:r>
+        <w:rPr>
+          <w:rStyle w:val="HTML"/>
+          <w:rFonts w:ascii="Times New Roman" w:hAnsi="Times New Roman" w:cs="Times New Roman"/>
+          <w:b/>
+          <w:sz w:val="28"/>
+          <w:szCs w:val="28"/>
+        </w:rPr>
+        <w:t>Radix</w:t>
+      </w:r>
+      <w:proofErr w:type="spellEnd"/>
+      <w:r>
+        <w:rPr>
+          <w:rStyle w:val="HTML"/>
+          <w:rFonts w:ascii="Times New Roman" w:hAnsi="Times New Roman" w:cs="Times New Roman"/>
+          <w:b/>
+          <w:sz w:val="28"/>
+          <w:szCs w:val="28"/>
+        </w:rPr>
+        <w:t xml:space="preserve"> UI</w:t>
+      </w:r>
+      <w:r>
+        <w:t xml:space="preserve">. Для візуалізації фінансових ризиків та аналітики застосовано бібліотеку </w:t>
+      </w:r>
+      <w:proofErr w:type="spellStart"/>
+      <w:r>
+        <w:rPr>
+          <w:rStyle w:val="HTML"/>
+          <w:rFonts w:ascii="Times New Roman" w:hAnsi="Times New Roman" w:cs="Times New Roman"/>
+          <w:b/>
+          <w:sz w:val="28"/>
+          <w:szCs w:val="28"/>
+        </w:rPr>
+        <w:t>Recharts</w:t>
+      </w:r>
+      <w:proofErr w:type="spellEnd"/>
+      <w:r>
+        <w:t>.</w:t>
       </w:r>
     </w:p>
     <w:p>
@@ -4653,15 +4955,87 @@
           <w:szCs w:val="28"/>
           <w:lang w:val="uk-UA"/>
         </w:rPr>
-        <w:t>Бекенд (Backend):</w:t>
-      </w:r>
-      <w:r>
-        <w:rPr>
-          <w:sz w:val="28"/>
-          <w:szCs w:val="28"/>
-          <w:lang w:val="uk-UA"/>
-        </w:rPr>
-        <w:t xml:space="preserve"> Python (фреймворк FastAPI). Ця мова програмування є стандартом індустрії для систем аналізу даних, штучного інтелекту та написання автоматизованих скриптів. Вона дозволяє швидко розгорнути бекенд та легко інтегрувати математичні моделі для розрахунку ризиків.</w:t>
+        <w:t>Бази даних:</w:t>
+      </w:r>
+      <w:r>
+        <w:rPr>
+          <w:sz w:val="28"/>
+          <w:szCs w:val="28"/>
+          <w:lang w:val="uk-UA"/>
+        </w:rPr>
+        <w:t xml:space="preserve"> Комбінований підхід. </w:t>
+      </w:r>
+      <w:proofErr w:type="spellStart"/>
+      <w:r>
+        <w:rPr>
+          <w:sz w:val="28"/>
+          <w:szCs w:val="28"/>
+          <w:lang w:val="uk-UA"/>
+        </w:rPr>
+        <w:t>PostgreSQL</w:t>
+      </w:r>
+      <w:proofErr w:type="spellEnd"/>
+      <w:r>
+        <w:rPr>
+          <w:sz w:val="28"/>
+          <w:szCs w:val="28"/>
+          <w:lang w:val="uk-UA"/>
+        </w:rPr>
+        <w:t xml:space="preserve"> (SQL) для зберігання реляційних даних (облікові записи користувачів, налаштування об'єктів, ролі). </w:t>
+      </w:r>
+      <w:proofErr w:type="spellStart"/>
+      <w:r>
+        <w:rPr>
+          <w:sz w:val="28"/>
+          <w:szCs w:val="28"/>
+          <w:lang w:val="uk-UA"/>
+        </w:rPr>
+        <w:t>MongoDB</w:t>
+      </w:r>
+      <w:proofErr w:type="spellEnd"/>
+      <w:r>
+        <w:rPr>
+          <w:sz w:val="28"/>
+          <w:szCs w:val="28"/>
+          <w:lang w:val="uk-UA"/>
+        </w:rPr>
+        <w:t xml:space="preserve"> (</w:t>
+      </w:r>
+      <w:proofErr w:type="spellStart"/>
+      <w:r>
+        <w:rPr>
+          <w:sz w:val="28"/>
+          <w:szCs w:val="28"/>
+          <w:lang w:val="uk-UA"/>
+        </w:rPr>
+        <w:t>NoSQL</w:t>
+      </w:r>
+      <w:proofErr w:type="spellEnd"/>
+      <w:r>
+        <w:rPr>
+          <w:sz w:val="28"/>
+          <w:szCs w:val="28"/>
+          <w:lang w:val="uk-UA"/>
+        </w:rPr>
+        <w:t xml:space="preserve">) для зберігання неструктурованих </w:t>
+      </w:r>
+      <w:proofErr w:type="spellStart"/>
+      <w:r>
+        <w:rPr>
+          <w:sz w:val="28"/>
+          <w:szCs w:val="28"/>
+          <w:lang w:val="uk-UA"/>
+        </w:rPr>
+        <w:t>логів</w:t>
+      </w:r>
+      <w:proofErr w:type="spellEnd"/>
+      <w:r>
+        <w:rPr>
+          <w:sz w:val="28"/>
+          <w:szCs w:val="28"/>
+          <w:lang w:val="uk-UA"/>
+        </w:rPr>
+        <w:t xml:space="preserve"> подій безпеки та показників телеметрії.</w:t>
       </w:r>
     </w:p>
     <w:p>
@@ -4691,82 +5065,6 @@
           <w:szCs w:val="28"/>
           <w:lang w:val="uk-UA"/>
         </w:rPr>
-        <w:t>Фронтенд (Frontend):</w:t>
-      </w:r>
-      <w:r>
-        <w:rPr>
-          <w:sz w:val="28"/>
-          <w:szCs w:val="28"/>
-          <w:lang w:val="uk-UA"/>
-        </w:rPr>
-        <w:t xml:space="preserve"> React.js. Сучасний фреймворк для побудови реактивних дашбордів, що будуть оновлюватися в режимі реального часу без перезавантаження сторінки.</w:t>
-      </w:r>
-    </w:p>
-    <w:p>
-      <w:pPr>
-        <w:pStyle w:val="a3"/>
-        <w:numPr>
-          <w:ilvl w:val="0"/>
-          <w:numId w:val="7"/>
-        </w:numPr>
-        <w:tabs>
-          <w:tab w:val="left" w:pos="993"/>
-        </w:tabs>
-        <w:spacing w:before="0" w:beforeAutospacing="0" w:after="0" w:afterAutospacing="0"/>
-        <w:ind w:left="0" w:firstLine="709"/>
-        <w:jc w:val="both"/>
-        <w:rPr>
-          <w:sz w:val="28"/>
-          <w:szCs w:val="28"/>
-          <w:lang w:val="uk-UA"/>
-        </w:rPr>
-      </w:pPr>
-      <w:r>
-        <w:rPr>
-          <w:b/>
-          <w:bCs/>
-          <w:sz w:val="28"/>
-          <w:szCs w:val="28"/>
-          <w:lang w:val="uk-UA"/>
-        </w:rPr>
-        <w:t>Бази даних:</w:t>
-      </w:r>
-      <w:r>
-        <w:rPr>
-          <w:sz w:val="28"/>
-          <w:szCs w:val="28"/>
-          <w:lang w:val="uk-UA"/>
-        </w:rPr>
-        <w:t xml:space="preserve"> Комбінований підхід. PostgreSQL (SQL) для зберігання реляційних даних (облікові записи користувачів, налаштування об'єктів, ролі). MongoDB (NoSQL) для зберігання неструктурованих логів подій безпеки та показників телеметрії.</w:t>
-      </w:r>
-    </w:p>
-    <w:p>
-      <w:pPr>
-        <w:pStyle w:val="a3"/>
-        <w:numPr>
-          <w:ilvl w:val="0"/>
-          <w:numId w:val="7"/>
-        </w:numPr>
-        <w:tabs>
-          <w:tab w:val="left" w:pos="993"/>
-        </w:tabs>
-        <w:spacing w:before="0" w:beforeAutospacing="0" w:after="0" w:afterAutospacing="0"/>
-        <w:ind w:left="0" w:firstLine="709"/>
-        <w:jc w:val="both"/>
-        <w:rPr>
-          <w:sz w:val="28"/>
-          <w:szCs w:val="28"/>
-          <w:lang w:val="uk-UA"/>
-        </w:rPr>
-      </w:pPr>
-      <w:r>
-        <w:rPr>
-          <w:b/>
-          <w:bCs/>
-          <w:sz w:val="28"/>
-          <w:szCs w:val="28"/>
-          <w:lang w:val="uk-UA"/>
-        </w:rPr>
         <w:t>API:</w:t>
       </w:r>
       <w:r>
@@ -4830,26 +5128,34 @@
     </w:p>
     <w:p>
       <w:pPr>
-        <w:pStyle w:val="a3"/>
-        <w:tabs>
-          <w:tab w:val="left" w:pos="993"/>
-        </w:tabs>
-        <w:spacing w:before="0" w:beforeAutospacing="0" w:after="0" w:afterAutospacing="0"/>
-        <w:ind w:firstLine="709"/>
-        <w:jc w:val="both"/>
-        <w:rPr>
-          <w:sz w:val="28"/>
-          <w:szCs w:val="28"/>
-          <w:lang w:val="uk-UA"/>
-        </w:rPr>
-      </w:pPr>
-      <w:r>
-        <w:rPr>
-          <w:sz w:val="28"/>
-          <w:szCs w:val="28"/>
-          <w:lang w:val="uk-UA"/>
-        </w:rPr>
-        <w:t>Використовуватиметься хмарна інфраструктура (Google Cloud Platform або AWS). Хмарне середовище забезпечує високу доступність (99.9%), що є критично важливим для систем моніторингу об'єктів відновлювальної енергетики. Крім того, це дозволяє легко масштабувати обчислювальні потужності у разі підключення нових сонячних чи вітрових електростанцій до мережі.</w:t>
+        <w:pStyle w:val="ae"/>
+      </w:pPr>
+      <w:r>
+        <w:t>Використовуватиметься хмарна інфраструктура (</w:t>
+      </w:r>
+      <w:proofErr w:type="spellStart"/>
+      <w:r>
+        <w:t>Google</w:t>
+      </w:r>
+      <w:proofErr w:type="spellEnd"/>
+      <w:r>
+        <w:t xml:space="preserve"> </w:t>
+      </w:r>
+      <w:proofErr w:type="spellStart"/>
+      <w:r>
+        <w:t>Cloud</w:t>
+      </w:r>
+      <w:proofErr w:type="spellEnd"/>
+      <w:r>
+        <w:t xml:space="preserve"> </w:t>
+      </w:r>
+      <w:proofErr w:type="spellStart"/>
+      <w:r>
+        <w:t>Platform</w:t>
+      </w:r>
+      <w:proofErr w:type="spellEnd"/>
+      <w:r>
+        <w:t xml:space="preserve"> або AWS). Хмарне середовище забезпечує високу доступність (99.9%), що є критично важливим для систем моніторингу об'єктів відновлювальної енергетики. Крім того, це дозволяє легко масштабувати обчислювальні потужності у разі підключення нових сонячних чи вітрових електростанцій до мережі.</w:t>
       </w:r>
     </w:p>
     <w:p>
@@ -4953,6 +5259,7 @@
           <w:szCs w:val="28"/>
           <w:lang w:val="uk-UA"/>
         </w:rPr>
+        <w:lastRenderedPageBreak/>
         <w:t>Інтеграція зі SCADA:</w:t>
       </w:r>
       <w:r>
@@ -5025,7 +5332,6 @@
           <w:szCs w:val="28"/>
           <w:lang w:val="uk-UA"/>
         </w:rPr>
-        <w:lastRenderedPageBreak/>
         <w:t>2.5. Блок-схема архітектури системи</w:t>
       </w:r>
       <w:r>
@@ -5511,8 +5817,12 @@
     </w:p>
     <w:p>
       <w:pPr>
-        <w:rPr>
-          <w:rFonts w:ascii="Times New Roman" w:eastAsia="Times New Roman" w:hAnsi="Times New Roman" w:cs="Times New Roman"/>
+        <w:spacing w:after="0"/>
+        <w:jc w:val="center"/>
+        <w:rPr>
+          <w:rFonts w:ascii="Times New Roman" w:eastAsia="Times New Roman" w:hAnsi="Times New Roman" w:cs="Times New Roman"/>
+          <w:b/>
+          <w:bCs/>
           <w:sz w:val="28"/>
           <w:szCs w:val="28"/>
           <w:lang w:val="uk-UA" w:eastAsia="ru-RU"/>
@@ -5527,63 +5837,48 @@
         </w:rPr>
         <w:br w:type="page"/>
       </w:r>
-    </w:p>
-    <w:p>
-      <w:pPr>
+      <w:r>
+        <w:rPr>
+          <w:rFonts w:ascii="Times New Roman" w:eastAsia="Times New Roman" w:hAnsi="Times New Roman" w:cs="Times New Roman"/>
+          <w:b/>
+          <w:bCs/>
+          <w:sz w:val="28"/>
+          <w:szCs w:val="28"/>
+          <w:lang w:val="uk-UA" w:eastAsia="ru-RU"/>
+        </w:rPr>
+        <w:lastRenderedPageBreak/>
+        <w:t>Розділ 3</w:t>
+      </w:r>
+      <w:r>
+        <w:rPr>
+          <w:rFonts w:ascii="Times New Roman" w:eastAsia="Times New Roman" w:hAnsi="Times New Roman" w:cs="Times New Roman"/>
+          <w:b/>
+          <w:bCs/>
+          <w:sz w:val="28"/>
+          <w:szCs w:val="28"/>
+          <w:lang w:val="uk-UA" w:eastAsia="ru-RU"/>
+        </w:rPr>
+        <w:t xml:space="preserve">. </w:t>
+      </w:r>
+      <w:r>
+        <w:rPr>
+          <w:rFonts w:ascii="Times New Roman" w:eastAsia="Times New Roman" w:hAnsi="Times New Roman" w:cs="Times New Roman"/>
+          <w:b/>
+          <w:bCs/>
+          <w:sz w:val="28"/>
+          <w:szCs w:val="28"/>
+          <w:lang w:val="uk-UA" w:eastAsia="ru-RU"/>
+        </w:rPr>
+        <w:t>ПРОЄКТУВАННЯ БАЗИ ДАНИХ</w:t>
+      </w:r>
+    </w:p>
+    <w:p>
+      <w:pPr>
+        <w:tabs>
+          <w:tab w:val="left" w:pos="993"/>
+        </w:tabs>
         <w:spacing w:after="0"/>
         <w:ind w:firstLine="709"/>
-        <w:jc w:val="center"/>
-        <w:rPr>
-          <w:rFonts w:ascii="Times New Roman" w:eastAsia="Times New Roman" w:hAnsi="Times New Roman" w:cs="Times New Roman"/>
-          <w:b/>
-          <w:bCs/>
-          <w:sz w:val="28"/>
-          <w:szCs w:val="28"/>
-          <w:lang w:val="uk-UA" w:eastAsia="ru-RU"/>
-        </w:rPr>
-      </w:pPr>
-      <w:r>
-        <w:rPr>
-          <w:rFonts w:ascii="Times New Roman" w:eastAsia="Times New Roman" w:hAnsi="Times New Roman" w:cs="Times New Roman"/>
-          <w:b/>
-          <w:bCs/>
-          <w:sz w:val="28"/>
-          <w:szCs w:val="28"/>
-          <w:lang w:val="uk-UA" w:eastAsia="ru-RU"/>
-        </w:rPr>
-        <w:lastRenderedPageBreak/>
-        <w:t>Розділ 3</w:t>
-      </w:r>
-      <w:r>
-        <w:rPr>
-          <w:rFonts w:ascii="Times New Roman" w:eastAsia="Times New Roman" w:hAnsi="Times New Roman" w:cs="Times New Roman"/>
-          <w:b/>
-          <w:bCs/>
-          <w:sz w:val="28"/>
-          <w:szCs w:val="28"/>
-          <w:lang w:val="uk-UA" w:eastAsia="ru-RU"/>
-        </w:rPr>
-        <w:t xml:space="preserve">. </w:t>
-      </w:r>
-      <w:r>
-        <w:rPr>
-          <w:rFonts w:ascii="Times New Roman" w:eastAsia="Times New Roman" w:hAnsi="Times New Roman" w:cs="Times New Roman"/>
-          <w:b/>
-          <w:bCs/>
-          <w:sz w:val="28"/>
-          <w:szCs w:val="28"/>
-          <w:lang w:val="uk-UA" w:eastAsia="ru-RU"/>
-        </w:rPr>
-        <w:t>ПРОЄКТУВАННЯ БАЗИ ДАНИХ</w:t>
-      </w:r>
-    </w:p>
-    <w:p>
-      <w:pPr>
-        <w:tabs>
-          <w:tab w:val="left" w:pos="993"/>
-        </w:tabs>
-        <w:spacing w:after="0"/>
-        <w:ind w:firstLine="709"/>
         <w:jc w:val="both"/>
         <w:rPr>
           <w:rFonts w:ascii="Times New Roman" w:eastAsia="Times New Roman" w:hAnsi="Times New Roman" w:cs="Times New Roman"/>
@@ -5687,97 +5982,177 @@
     </w:p>
     <w:p>
       <w:pPr>
+        <w:pStyle w:val="ae"/>
         <w:numPr>
           <w:ilvl w:val="0"/>
-          <w:numId w:val="11"/>
+          <w:numId w:val="40"/>
         </w:numPr>
         <w:tabs>
-          <w:tab w:val="left" w:pos="993"/>
-        </w:tabs>
-        <w:spacing w:after="0" w:line="240" w:lineRule="auto"/>
+          <w:tab w:val="clear" w:pos="720"/>
+          <w:tab w:val="num" w:pos="993"/>
+        </w:tabs>
         <w:ind w:left="0" w:firstLine="709"/>
-        <w:jc w:val="both"/>
-        <w:rPr>
-          <w:rFonts w:ascii="Times New Roman" w:eastAsia="Times New Roman" w:hAnsi="Times New Roman" w:cs="Times New Roman"/>
-          <w:sz w:val="28"/>
-          <w:szCs w:val="28"/>
-          <w:lang w:val="uk-UA" w:eastAsia="ru-RU"/>
-        </w:rPr>
-      </w:pPr>
-      <w:r>
-        <w:rPr>
-          <w:rFonts w:ascii="Times New Roman" w:eastAsia="Times New Roman" w:hAnsi="Times New Roman" w:cs="Times New Roman"/>
-          <w:b/>
-          <w:bCs/>
-          <w:sz w:val="28"/>
-          <w:szCs w:val="28"/>
-          <w:lang w:val="uk-UA" w:eastAsia="ru-RU"/>
-        </w:rPr>
-        <w:t>Реляційна частина (PostgreSQL):</w:t>
-      </w:r>
-      <w:r>
-        <w:rPr>
-          <w:rFonts w:ascii="Times New Roman" w:eastAsia="Times New Roman" w:hAnsi="Times New Roman" w:cs="Times New Roman"/>
-          <w:sz w:val="28"/>
-          <w:szCs w:val="28"/>
-          <w:lang w:val="uk-UA" w:eastAsia="ru-RU"/>
-        </w:rPr>
-        <w:t xml:space="preserve"> Зберігає чітко структуровані дані — профілі користувачів (CISO, PM, Інженери), об'єкти інфраструктури (СЕС/ВЕС), налаштування доступу та довідник класифікованих ІТ-ризиків. Фізично ці дані зберігаються у вигляді нормалізованих таблиць (до третьої нормальної форми, 3NF) для забезпечення строгої цілісності даних.</w:t>
-      </w:r>
-    </w:p>
-    <w:p>
-      <w:pPr>
+      </w:pPr>
+      <w:r>
+        <w:rPr>
+          <w:b/>
+          <w:bCs/>
+        </w:rPr>
+        <w:t>Реляційна частина (</w:t>
+      </w:r>
+      <w:proofErr w:type="spellStart"/>
+      <w:r>
+        <w:rPr>
+          <w:b/>
+          <w:bCs/>
+        </w:rPr>
+        <w:t>PostgreSQL</w:t>
+      </w:r>
+      <w:proofErr w:type="spellEnd"/>
+      <w:r>
+        <w:rPr>
+          <w:b/>
+          <w:bCs/>
+        </w:rPr>
+        <w:t>):</w:t>
+      </w:r>
+      <w:r>
+        <w:t xml:space="preserve"> Зберігає суворо структуровані дані. Ключовою є таблиця </w:t>
+      </w:r>
+      <w:proofErr w:type="spellStart"/>
+      <w:r>
+        <w:rPr>
+          <w:rStyle w:val="HTML"/>
+          <w:rFonts w:ascii="Times New Roman" w:hAnsi="Times New Roman" w:cs="Times New Roman"/>
+          <w:b/>
+          <w:sz w:val="28"/>
+          <w:szCs w:val="28"/>
+        </w:rPr>
+        <w:t>Equipment</w:t>
+      </w:r>
+      <w:proofErr w:type="spellEnd"/>
+      <w:r>
+        <w:t xml:space="preserve">, яка має ієрархічну структуру (зв'язок Parent-Child) для симуляції каскадних відключень мережі. Також тут зберігаються таблиці </w:t>
+      </w:r>
+      <w:proofErr w:type="spellStart"/>
+      <w:r>
+        <w:rPr>
+          <w:rStyle w:val="HTML"/>
+          <w:rFonts w:ascii="Times New Roman" w:hAnsi="Times New Roman" w:cs="Times New Roman"/>
+          <w:b/>
+          <w:sz w:val="28"/>
+          <w:szCs w:val="28"/>
+        </w:rPr>
+        <w:t>RiskAssessment</w:t>
+      </w:r>
+      <w:proofErr w:type="spellEnd"/>
+      <w:r>
+        <w:t xml:space="preserve"> (результати оцінки ризиків), </w:t>
+      </w:r>
+      <w:proofErr w:type="spellStart"/>
+      <w:r>
+        <w:rPr>
+          <w:rStyle w:val="HTML"/>
+          <w:rFonts w:ascii="Times New Roman" w:hAnsi="Times New Roman" w:cs="Times New Roman"/>
+          <w:b/>
+          <w:sz w:val="28"/>
+          <w:szCs w:val="28"/>
+        </w:rPr>
+        <w:t>ThreatArchive</w:t>
+      </w:r>
+      <w:proofErr w:type="spellEnd"/>
+      <w:r>
+        <w:t xml:space="preserve"> та профілі користувачів (</w:t>
+      </w:r>
+      <w:proofErr w:type="spellStart"/>
+      <w:r>
+        <w:rPr>
+          <w:rStyle w:val="HTML"/>
+          <w:rFonts w:ascii="Times New Roman" w:hAnsi="Times New Roman" w:cs="Times New Roman"/>
+          <w:b/>
+          <w:sz w:val="28"/>
+          <w:szCs w:val="28"/>
+        </w:rPr>
+        <w:t>Users</w:t>
+      </w:r>
+      <w:proofErr w:type="spellEnd"/>
+      <w:r>
+        <w:t xml:space="preserve">) з </w:t>
+      </w:r>
+      <w:proofErr w:type="spellStart"/>
+      <w:r>
+        <w:t>хешами</w:t>
+      </w:r>
+      <w:proofErr w:type="spellEnd"/>
+      <w:r>
+        <w:t xml:space="preserve"> паролів. </w:t>
+      </w:r>
+    </w:p>
+    <w:p>
+      <w:pPr>
+        <w:pStyle w:val="ae"/>
         <w:numPr>
           <w:ilvl w:val="0"/>
-          <w:numId w:val="11"/>
+          <w:numId w:val="40"/>
         </w:numPr>
         <w:tabs>
-          <w:tab w:val="left" w:pos="993"/>
-        </w:tabs>
-        <w:spacing w:after="0" w:line="240" w:lineRule="auto"/>
+          <w:tab w:val="clear" w:pos="720"/>
+          <w:tab w:val="num" w:pos="993"/>
+        </w:tabs>
         <w:ind w:left="0" w:firstLine="709"/>
-        <w:jc w:val="both"/>
-        <w:rPr>
-          <w:rFonts w:ascii="Times New Roman" w:eastAsia="Times New Roman" w:hAnsi="Times New Roman" w:cs="Times New Roman"/>
-          <w:sz w:val="28"/>
-          <w:szCs w:val="28"/>
-          <w:lang w:val="uk-UA" w:eastAsia="ru-RU"/>
-        </w:rPr>
-      </w:pPr>
-      <w:r>
-        <w:rPr>
-          <w:rFonts w:ascii="Times New Roman" w:eastAsia="Times New Roman" w:hAnsi="Times New Roman" w:cs="Times New Roman"/>
-          <w:b/>
-          <w:bCs/>
-          <w:sz w:val="28"/>
-          <w:szCs w:val="28"/>
-          <w:lang w:val="uk-UA" w:eastAsia="ru-RU"/>
-        </w:rPr>
-        <w:t>Нереляційна частина (MongoDB):</w:t>
-      </w:r>
-      <w:r>
-        <w:rPr>
-          <w:rFonts w:ascii="Times New Roman" w:eastAsia="Times New Roman" w:hAnsi="Times New Roman" w:cs="Times New Roman"/>
-          <w:sz w:val="28"/>
-          <w:szCs w:val="28"/>
-          <w:lang w:val="uk-UA" w:eastAsia="ru-RU"/>
-        </w:rPr>
-        <w:t xml:space="preserve"> Зберігає неструктуровані масиви часових рядів (Time-Series) — телеметрію з IoT-датчиків, мережеві логи та потоки подій безпеки. Фізична структура базується на BSON-документах (бінарний JSON), що дозволяє надшвидкий запис.</w:t>
-      </w:r>
-    </w:p>
-    <w:p>
-      <w:pPr>
-        <w:tabs>
-          <w:tab w:val="left" w:pos="993"/>
-        </w:tabs>
-        <w:spacing w:after="0" w:line="240" w:lineRule="auto"/>
-        <w:jc w:val="both"/>
-        <w:rPr>
-          <w:rFonts w:ascii="Times New Roman" w:eastAsia="Times New Roman" w:hAnsi="Times New Roman" w:cs="Times New Roman"/>
-          <w:sz w:val="28"/>
-          <w:szCs w:val="28"/>
-          <w:lang w:val="uk-UA" w:eastAsia="ru-RU"/>
-        </w:rPr>
+      </w:pPr>
+      <w:proofErr w:type="spellStart"/>
+      <w:r>
+        <w:rPr>
+          <w:b/>
+          <w:bCs/>
+        </w:rPr>
+        <w:t>Нереляційна</w:t>
+      </w:r>
+      <w:proofErr w:type="spellEnd"/>
+      <w:r>
+        <w:rPr>
+          <w:b/>
+          <w:bCs/>
+        </w:rPr>
+        <w:t xml:space="preserve"> частина (</w:t>
+      </w:r>
+      <w:proofErr w:type="spellStart"/>
+      <w:r>
+        <w:rPr>
+          <w:b/>
+          <w:bCs/>
+        </w:rPr>
+        <w:t>MongoDB</w:t>
+      </w:r>
+      <w:proofErr w:type="spellEnd"/>
+      <w:r>
+        <w:rPr>
+          <w:b/>
+          <w:bCs/>
+        </w:rPr>
+        <w:t>):</w:t>
+      </w:r>
+      <w:r>
+        <w:t xml:space="preserve"> Зберігає неструктуровані масиви часових рядів (Time-Series) у колекції </w:t>
+      </w:r>
+      <w:r>
+        <w:rPr>
+          <w:rStyle w:val="HTML"/>
+          <w:rFonts w:ascii="Times New Roman" w:hAnsi="Times New Roman" w:cs="Times New Roman"/>
+          <w:b/>
+          <w:sz w:val="28"/>
+          <w:szCs w:val="28"/>
+        </w:rPr>
+        <w:t>security_logs_collection</w:t>
+      </w:r>
+      <w:r>
+        <w:t>. Тут фіксуються всі події безпеки, телеметрія та дії автоматизованої системи реагування.</w:t>
+      </w:r>
+    </w:p>
+    <w:p>
+      <w:pPr>
+        <w:pStyle w:val="ae"/>
       </w:pPr>
     </w:p>
     <w:p>
@@ -6342,7 +6717,6 @@
           <w:szCs w:val="28"/>
           <w:lang w:val="uk-UA" w:eastAsia="ru-RU"/>
         </w:rPr>
-        <w:lastRenderedPageBreak/>
         <w:t>Users</w:t>
       </w:r>
       <w:r>
@@ -6403,6 +6777,7 @@
           <w:szCs w:val="28"/>
           <w:lang w:val="uk-UA" w:eastAsia="ru-RU"/>
         </w:rPr>
+        <w:lastRenderedPageBreak/>
         <w:t>Projects</w:t>
       </w:r>
       <w:r>
@@ -6730,7 +7105,6 @@
           <w:szCs w:val="28"/>
           <w:lang w:val="uk-UA" w:eastAsia="ru-RU"/>
         </w:rPr>
-        <w:lastRenderedPageBreak/>
         <w:t>Розділ 4</w:t>
       </w:r>
       <w:r>
@@ -7334,7 +7708,6 @@
           <w:szCs w:val="28"/>
           <w:lang w:val="uk-UA"/>
         </w:rPr>
-        <w:lastRenderedPageBreak/>
         <w:t>Аутентифікація пристроїв:</w:t>
       </w:r>
       <w:r>
@@ -8033,17 +8406,26 @@
           <w:szCs w:val="28"/>
           <w:lang w:val="uk-UA" w:eastAsia="ru-RU"/>
         </w:rPr>
+        <w:t>Оптимізація UX та завантаження:</w:t>
+      </w:r>
+      <w:r>
+        <w:rPr>
+          <w:rFonts w:ascii="Times New Roman" w:eastAsia="Times New Roman" w:hAnsi="Times New Roman" w:cs="Times New Roman"/>
+          <w:sz w:val="28"/>
+          <w:szCs w:val="28"/>
+          <w:lang w:val="uk-UA" w:eastAsia="ru-RU"/>
+        </w:rPr>
+        <w:t xml:space="preserve"> Для швидкого рендерингу важких графіків (матриця ризиків 5х5 із тисячами точок-інцидентів) застосовано технологію "лінивого завантаження" (Lazy Loading). Дані підвантажуються </w:t>
+      </w:r>
+      <w:r>
+        <w:rPr>
+          <w:rFonts w:ascii="Times New Roman" w:eastAsia="Times New Roman" w:hAnsi="Times New Roman" w:cs="Times New Roman"/>
+          <w:sz w:val="28"/>
+          <w:szCs w:val="28"/>
+          <w:lang w:val="uk-UA" w:eastAsia="ru-RU"/>
+        </w:rPr>
         <w:lastRenderedPageBreak/>
-        <w:t>Оптимізація UX та завантаження:</w:t>
-      </w:r>
-      <w:r>
-        <w:rPr>
-          <w:rFonts w:ascii="Times New Roman" w:eastAsia="Times New Roman" w:hAnsi="Times New Roman" w:cs="Times New Roman"/>
-          <w:sz w:val="28"/>
-          <w:szCs w:val="28"/>
-          <w:lang w:val="uk-UA" w:eastAsia="ru-RU"/>
-        </w:rPr>
-        <w:t xml:space="preserve"> Для швидкого рендерингу важких графіків (матриця ризиків 5х5 із тисячами точок-інцидентів) застосовано технологію "лінивого завантаження" (Lazy Loading). Дані підвантажуються частинами у фоновому режимі, що значно покращує показники швидкості завантаження (First Contentful Paint).</w:t>
+        <w:t>частинами у фоновому режимі, що значно покращує показники швидкості завантаження (First Contentful Paint).</w:t>
       </w:r>
     </w:p>
     <w:p>
@@ -8705,7 +9087,6 @@
           <w:szCs w:val="28"/>
           <w:lang w:val="uk-UA" w:eastAsia="ru-RU"/>
         </w:rPr>
-        <w:lastRenderedPageBreak/>
         <w:t xml:space="preserve">Розділ </w:t>
       </w:r>
       <w:r>
@@ -8816,6 +9197,7 @@
           <w:szCs w:val="28"/>
           <w:lang w:val="uk-UA" w:eastAsia="ru-RU"/>
         </w:rPr>
+        <w:lastRenderedPageBreak/>
         <w:t>Для забезпечення конфіденційності та цілісності інформації в експертній системі впроваджено наскрізне шифрування.</w:t>
       </w:r>
     </w:p>
@@ -8991,7 +9373,207 @@
           <w:szCs w:val="28"/>
           <w:lang w:val="uk-UA" w:eastAsia="ru-RU"/>
         </w:rPr>
-        <w:t>У системі впроваджено модель управління доступом на основі ролей (RBAC – Role-Based Access Control). Наприклад, Project Manager має доступ лише до фінансової аналітики та матриці ризиків, тоді як CISO отримує доступ до логів серверів та управління політиками безпеки. Для практичного захисту облікових записів персоналу реалізовано двофакторну автентифікацію (2FA). При вході в систему, окрім логіна та пароля, користувач зобов'язаний ввести одноразовий 6-значний код (TOTP), згенерований у додатку (наприклад, Google Authenticator). Це критично знижує ризик несанкціонованого доступу при компрометації пароля.</w:t>
+        <w:t xml:space="preserve">У системі впроваджено жорстку модель управління доступом на основі ролей (RBAC). Реалізовано 3 основні профілі: CEO, CISO (керівник </w:t>
+      </w:r>
+      <w:proofErr w:type="spellStart"/>
+      <w:r>
+        <w:rPr>
+          <w:rFonts w:ascii="Times New Roman" w:eastAsia="Times New Roman" w:hAnsi="Times New Roman" w:cs="Times New Roman"/>
+          <w:sz w:val="28"/>
+          <w:szCs w:val="28"/>
+          <w:lang w:val="uk-UA" w:eastAsia="ru-RU"/>
+        </w:rPr>
+        <w:t>інформ</w:t>
+      </w:r>
+      <w:proofErr w:type="spellEnd"/>
+      <w:r>
+        <w:rPr>
+          <w:rFonts w:ascii="Times New Roman" w:eastAsia="Times New Roman" w:hAnsi="Times New Roman" w:cs="Times New Roman"/>
+          <w:sz w:val="28"/>
+          <w:szCs w:val="28"/>
+          <w:lang w:val="uk-UA" w:eastAsia="ru-RU"/>
+        </w:rPr>
+        <w:t xml:space="preserve">. безпеки) та PM (керівник </w:t>
+      </w:r>
+      <w:proofErr w:type="spellStart"/>
+      <w:r>
+        <w:rPr>
+          <w:rFonts w:ascii="Times New Roman" w:eastAsia="Times New Roman" w:hAnsi="Times New Roman" w:cs="Times New Roman"/>
+          <w:sz w:val="28"/>
+          <w:szCs w:val="28"/>
+          <w:lang w:val="uk-UA" w:eastAsia="ru-RU"/>
+        </w:rPr>
+        <w:t>проєктів</w:t>
+      </w:r>
+      <w:proofErr w:type="spellEnd"/>
+      <w:r>
+        <w:rPr>
+          <w:rFonts w:ascii="Times New Roman" w:eastAsia="Times New Roman" w:hAnsi="Times New Roman" w:cs="Times New Roman"/>
+          <w:sz w:val="28"/>
+          <w:szCs w:val="28"/>
+          <w:lang w:val="uk-UA" w:eastAsia="ru-RU"/>
+        </w:rPr>
+        <w:t xml:space="preserve">). На рівні API доступ до </w:t>
+      </w:r>
+      <w:proofErr w:type="spellStart"/>
+      <w:r>
+        <w:rPr>
+          <w:rFonts w:ascii="Times New Roman" w:eastAsia="Times New Roman" w:hAnsi="Times New Roman" w:cs="Times New Roman"/>
+          <w:sz w:val="28"/>
+          <w:szCs w:val="28"/>
+          <w:lang w:val="uk-UA" w:eastAsia="ru-RU"/>
+        </w:rPr>
+        <w:t>ендпоінтів</w:t>
+      </w:r>
+      <w:proofErr w:type="spellEnd"/>
+      <w:r>
+        <w:rPr>
+          <w:rFonts w:ascii="Times New Roman" w:eastAsia="Times New Roman" w:hAnsi="Times New Roman" w:cs="Times New Roman"/>
+          <w:sz w:val="28"/>
+          <w:szCs w:val="28"/>
+          <w:lang w:val="uk-UA" w:eastAsia="ru-RU"/>
+        </w:rPr>
+        <w:t xml:space="preserve"> контролюється залежно від ролі (наприклад, PM не має доступу до управління обладнанням, а CISO — до фінансової аналітики). Процес входу реалізовано на базі </w:t>
+      </w:r>
+      <w:proofErr w:type="spellStart"/>
+      <w:r>
+        <w:rPr>
+          <w:rFonts w:ascii="Times New Roman" w:eastAsia="Times New Roman" w:hAnsi="Times New Roman" w:cs="Times New Roman"/>
+          <w:sz w:val="28"/>
+          <w:szCs w:val="28"/>
+          <w:lang w:val="uk-UA" w:eastAsia="ru-RU"/>
+        </w:rPr>
+        <w:t>токенів</w:t>
+      </w:r>
+      <w:proofErr w:type="spellEnd"/>
+      <w:r>
+        <w:rPr>
+          <w:rFonts w:ascii="Times New Roman" w:eastAsia="Times New Roman" w:hAnsi="Times New Roman" w:cs="Times New Roman"/>
+          <w:sz w:val="28"/>
+          <w:szCs w:val="28"/>
+          <w:lang w:val="uk-UA" w:eastAsia="ru-RU"/>
+        </w:rPr>
+        <w:t xml:space="preserve"> (JSON </w:t>
+      </w:r>
+      <w:proofErr w:type="spellStart"/>
+      <w:r>
+        <w:rPr>
+          <w:rFonts w:ascii="Times New Roman" w:eastAsia="Times New Roman" w:hAnsi="Times New Roman" w:cs="Times New Roman"/>
+          <w:sz w:val="28"/>
+          <w:szCs w:val="28"/>
+          <w:lang w:val="uk-UA" w:eastAsia="ru-RU"/>
+        </w:rPr>
+        <w:t>Web</w:t>
+      </w:r>
+      <w:proofErr w:type="spellEnd"/>
+      <w:r>
+        <w:rPr>
+          <w:rFonts w:ascii="Times New Roman" w:eastAsia="Times New Roman" w:hAnsi="Times New Roman" w:cs="Times New Roman"/>
+          <w:sz w:val="28"/>
+          <w:szCs w:val="28"/>
+          <w:lang w:val="uk-UA" w:eastAsia="ru-RU"/>
+        </w:rPr>
+        <w:t xml:space="preserve"> </w:t>
+      </w:r>
+      <w:proofErr w:type="spellStart"/>
+      <w:r>
+        <w:rPr>
+          <w:rFonts w:ascii="Times New Roman" w:eastAsia="Times New Roman" w:hAnsi="Times New Roman" w:cs="Times New Roman"/>
+          <w:sz w:val="28"/>
+          <w:szCs w:val="28"/>
+          <w:lang w:val="uk-UA" w:eastAsia="ru-RU"/>
+        </w:rPr>
+        <w:t>Token</w:t>
+      </w:r>
+      <w:proofErr w:type="spellEnd"/>
+      <w:r>
+        <w:rPr>
+          <w:rFonts w:ascii="Times New Roman" w:eastAsia="Times New Roman" w:hAnsi="Times New Roman" w:cs="Times New Roman"/>
+          <w:sz w:val="28"/>
+          <w:szCs w:val="28"/>
+          <w:lang w:val="uk-UA" w:eastAsia="ru-RU"/>
+        </w:rPr>
+        <w:t xml:space="preserve">). Крім того, для захисту від компрометації паролів, реалізовано повноцінну </w:t>
+      </w:r>
+      <w:proofErr w:type="spellStart"/>
+      <w:r>
+        <w:rPr>
+          <w:rFonts w:ascii="Times New Roman" w:eastAsia="Times New Roman" w:hAnsi="Times New Roman" w:cs="Times New Roman"/>
+          <w:sz w:val="28"/>
+          <w:szCs w:val="28"/>
+          <w:lang w:val="uk-UA" w:eastAsia="ru-RU"/>
+        </w:rPr>
+        <w:t>двофакторну</w:t>
+      </w:r>
+      <w:proofErr w:type="spellEnd"/>
+      <w:r>
+        <w:rPr>
+          <w:rFonts w:ascii="Times New Roman" w:eastAsia="Times New Roman" w:hAnsi="Times New Roman" w:cs="Times New Roman"/>
+          <w:sz w:val="28"/>
+          <w:szCs w:val="28"/>
+          <w:lang w:val="uk-UA" w:eastAsia="ru-RU"/>
+        </w:rPr>
+        <w:t xml:space="preserve"> </w:t>
+      </w:r>
+      <w:proofErr w:type="spellStart"/>
+      <w:r>
+        <w:rPr>
+          <w:rFonts w:ascii="Times New Roman" w:eastAsia="Times New Roman" w:hAnsi="Times New Roman" w:cs="Times New Roman"/>
+          <w:sz w:val="28"/>
+          <w:szCs w:val="28"/>
+          <w:lang w:val="uk-UA" w:eastAsia="ru-RU"/>
+        </w:rPr>
+        <w:t>автентифікацію</w:t>
+      </w:r>
+      <w:proofErr w:type="spellEnd"/>
+      <w:r>
+        <w:rPr>
+          <w:rFonts w:ascii="Times New Roman" w:eastAsia="Times New Roman" w:hAnsi="Times New Roman" w:cs="Times New Roman"/>
+          <w:sz w:val="28"/>
+          <w:szCs w:val="28"/>
+          <w:lang w:val="uk-UA" w:eastAsia="ru-RU"/>
+        </w:rPr>
+        <w:t xml:space="preserve"> (2FA) з використанням алгоритму TOTP (Time-</w:t>
+      </w:r>
+      <w:proofErr w:type="spellStart"/>
+      <w:r>
+        <w:rPr>
+          <w:rFonts w:ascii="Times New Roman" w:eastAsia="Times New Roman" w:hAnsi="Times New Roman" w:cs="Times New Roman"/>
+          <w:sz w:val="28"/>
+          <w:szCs w:val="28"/>
+          <w:lang w:val="uk-UA" w:eastAsia="ru-RU"/>
+        </w:rPr>
+        <w:t>based</w:t>
+      </w:r>
+      <w:proofErr w:type="spellEnd"/>
+      <w:r>
+        <w:rPr>
+          <w:rFonts w:ascii="Times New Roman" w:eastAsia="Times New Roman" w:hAnsi="Times New Roman" w:cs="Times New Roman"/>
+          <w:sz w:val="28"/>
+          <w:szCs w:val="28"/>
+          <w:lang w:val="uk-UA" w:eastAsia="ru-RU"/>
+        </w:rPr>
+        <w:t xml:space="preserve"> One-Time </w:t>
+      </w:r>
+      <w:proofErr w:type="spellStart"/>
+      <w:r>
+        <w:rPr>
+          <w:rFonts w:ascii="Times New Roman" w:eastAsia="Times New Roman" w:hAnsi="Times New Roman" w:cs="Times New Roman"/>
+          <w:sz w:val="28"/>
+          <w:szCs w:val="28"/>
+          <w:lang w:val="uk-UA" w:eastAsia="ru-RU"/>
+        </w:rPr>
+        <w:t>Password</w:t>
+      </w:r>
+      <w:proofErr w:type="spellEnd"/>
+      <w:r>
+        <w:rPr>
+          <w:rFonts w:ascii="Times New Roman" w:eastAsia="Times New Roman" w:hAnsi="Times New Roman" w:cs="Times New Roman"/>
+          <w:sz w:val="28"/>
+          <w:szCs w:val="28"/>
+          <w:lang w:val="uk-UA" w:eastAsia="ru-RU"/>
+        </w:rPr>
+        <w:t>).</w:t>
       </w:r>
     </w:p>
     <w:p>
@@ -9314,7 +9896,6 @@
           <w:szCs w:val="28"/>
           <w:lang w:val="uk-UA" w:eastAsia="ru-RU"/>
         </w:rPr>
-        <w:lastRenderedPageBreak/>
         <w:t>6.5. Журналювання подій для аудиту</w:t>
       </w:r>
     </w:p>
@@ -9340,7 +9921,17 @@
           <w:szCs w:val="28"/>
           <w:lang w:val="uk-UA" w:eastAsia="ru-RU"/>
         </w:rPr>
-        <w:t>З метою своєчасного виявлення аномалій та ретроспективного розслідування інцидентів, налаштовано комплексне журналювання подій (Audit Logging). Система автоматично фіксує кожну критичну дію користувача (вхід у систему, зміна конфігурації обладнання, експорт звітів) та системні івенти. Запис аудиту включає: позначку часу (Timestamp), ідентифікатор користувача, IP-адресу та опис події. Логи зберігаються в ізольованому хмарному сховищі з політикою WORM (Write Once, Read Many), що унеможливлює їх видалення або підробку зловмисниками.</w:t>
+        <w:t xml:space="preserve">З метою своєчасного виявлення аномалій та ретроспективного розслідування інцидентів, налаштовано комплексне журналювання подій (Audit </w:t>
+      </w:r>
+      <w:r>
+        <w:rPr>
+          <w:rFonts w:ascii="Times New Roman" w:eastAsia="Times New Roman" w:hAnsi="Times New Roman" w:cs="Times New Roman"/>
+          <w:sz w:val="28"/>
+          <w:szCs w:val="28"/>
+          <w:lang w:val="uk-UA" w:eastAsia="ru-RU"/>
+        </w:rPr>
+        <w:lastRenderedPageBreak/>
+        <w:t>Logging). Система автоматично фіксує кожну критичну дію користувача (вхід у систему, зміна конфігурації обладнання, експорт звітів) та системні івенти. Запис аудиту включає: позначку часу (Timestamp), ідентифікатор користувача, IP-адресу та опис події. Логи зберігаються в ізольованому хмарному сховищі з політикою WORM (Write Once, Read Many), що унеможливлює їх видалення або підробку зловмисниками.</w:t>
       </w:r>
     </w:p>
     <w:p>
@@ -9432,107 +10023,139 @@
     </w:p>
     <w:p>
       <w:pPr>
-        <w:tabs>
-          <w:tab w:val="left" w:pos="993"/>
-        </w:tabs>
-        <w:spacing w:after="0" w:line="240" w:lineRule="auto"/>
-        <w:ind w:firstLine="709"/>
-        <w:jc w:val="both"/>
-        <w:rPr>
-          <w:rFonts w:ascii="Times New Roman" w:eastAsia="Times New Roman" w:hAnsi="Times New Roman" w:cs="Times New Roman"/>
-          <w:sz w:val="28"/>
-          <w:szCs w:val="28"/>
-          <w:lang w:val="uk-UA" w:eastAsia="ru-RU"/>
-        </w:rPr>
-      </w:pPr>
-      <w:r>
-        <w:rPr>
-          <w:rFonts w:ascii="Times New Roman" w:eastAsia="Times New Roman" w:hAnsi="Times New Roman" w:cs="Times New Roman"/>
-          <w:sz w:val="28"/>
-          <w:szCs w:val="28"/>
-          <w:lang w:val="uk-UA" w:eastAsia="ru-RU"/>
-        </w:rPr>
-        <w:t>Для забезпечення стабільної роботи експертної інформаційної системи (ЕІС) було впроваджено багаторівневе автоматизоване тестування.</w:t>
-      </w:r>
-    </w:p>
-    <w:p>
-      <w:pPr>
-        <w:numPr>
-          <w:ilvl w:val="0"/>
-          <w:numId w:val="27"/>
-        </w:numPr>
-        <w:tabs>
-          <w:tab w:val="left" w:pos="993"/>
-        </w:tabs>
-        <w:spacing w:after="0" w:line="240" w:lineRule="auto"/>
-        <w:ind w:left="0" w:firstLine="709"/>
-        <w:jc w:val="both"/>
-        <w:rPr>
-          <w:rFonts w:ascii="Times New Roman" w:eastAsia="Times New Roman" w:hAnsi="Times New Roman" w:cs="Times New Roman"/>
-          <w:sz w:val="28"/>
-          <w:szCs w:val="28"/>
-          <w:lang w:val="uk-UA" w:eastAsia="ru-RU"/>
-        </w:rPr>
-      </w:pPr>
-      <w:r>
-        <w:rPr>
-          <w:rFonts w:ascii="Times New Roman" w:eastAsia="Times New Roman" w:hAnsi="Times New Roman" w:cs="Times New Roman"/>
-          <w:b/>
-          <w:bCs/>
-          <w:sz w:val="28"/>
-          <w:szCs w:val="28"/>
-          <w:lang w:val="uk-UA" w:eastAsia="ru-RU"/>
-        </w:rPr>
-        <w:t>End-to-End (E2E) тестування:</w:t>
-      </w:r>
-      <w:r>
-        <w:rPr>
-          <w:rFonts w:ascii="Times New Roman" w:eastAsia="Times New Roman" w:hAnsi="Times New Roman" w:cs="Times New Roman"/>
-          <w:sz w:val="28"/>
-          <w:szCs w:val="28"/>
-          <w:lang w:val="uk-UA" w:eastAsia="ru-RU"/>
-        </w:rPr>
-        <w:t xml:space="preserve"> За допомогою фреймворку Cypress було автоматизовано перевірку ключових користувацьких сценаріїв (Use Cases), таких як успішна авторизація, генерація звіту та зміна статусів обладнання на дашборді.</w:t>
-      </w:r>
-    </w:p>
-    <w:p>
-      <w:pPr>
-        <w:numPr>
-          <w:ilvl w:val="0"/>
-          <w:numId w:val="27"/>
-        </w:numPr>
-        <w:tabs>
-          <w:tab w:val="left" w:pos="993"/>
-        </w:tabs>
-        <w:spacing w:after="0" w:line="240" w:lineRule="auto"/>
-        <w:ind w:left="0" w:firstLine="709"/>
-        <w:jc w:val="both"/>
-        <w:rPr>
-          <w:rFonts w:ascii="Times New Roman" w:eastAsia="Times New Roman" w:hAnsi="Times New Roman" w:cs="Times New Roman"/>
-          <w:sz w:val="28"/>
-          <w:szCs w:val="28"/>
-          <w:lang w:val="uk-UA" w:eastAsia="ru-RU"/>
-        </w:rPr>
-      </w:pPr>
-      <w:r>
-        <w:rPr>
-          <w:rFonts w:ascii="Times New Roman" w:eastAsia="Times New Roman" w:hAnsi="Times New Roman" w:cs="Times New Roman"/>
-          <w:b/>
-          <w:bCs/>
-          <w:sz w:val="28"/>
-          <w:szCs w:val="28"/>
-          <w:lang w:val="uk-UA" w:eastAsia="ru-RU"/>
-        </w:rPr>
-        <w:t>Інтеграційне тестування:</w:t>
-      </w:r>
-      <w:r>
-        <w:rPr>
-          <w:rFonts w:ascii="Times New Roman" w:eastAsia="Times New Roman" w:hAnsi="Times New Roman" w:cs="Times New Roman"/>
-          <w:sz w:val="28"/>
-          <w:szCs w:val="28"/>
-          <w:lang w:val="uk-UA" w:eastAsia="ru-RU"/>
-        </w:rPr>
-        <w:t xml:space="preserve"> Перевірено коректність взаємодії між фронтендом (React-додаток) та бекендом, зокрема правильність відображення розрахованої матриці ризиків на основі отриманих JSON-даних.</w:t>
+        <w:pStyle w:val="ae"/>
+      </w:pPr>
+      <w:r>
+        <w:t xml:space="preserve">Для гарантії стабільності </w:t>
+      </w:r>
+      <w:proofErr w:type="spellStart"/>
+      <w:r>
+        <w:t>бекенду</w:t>
+      </w:r>
+      <w:proofErr w:type="spellEnd"/>
+      <w:r>
+        <w:t xml:space="preserve"> розроблено набір автоматизованих </w:t>
+      </w:r>
+      <w:proofErr w:type="spellStart"/>
+      <w:r>
+        <w:t>юніт-тестів</w:t>
+      </w:r>
+      <w:proofErr w:type="spellEnd"/>
+      <w:r>
+        <w:t xml:space="preserve"> за допомогою </w:t>
+      </w:r>
+      <w:proofErr w:type="spellStart"/>
+      <w:r>
+        <w:t>фреймворку</w:t>
+      </w:r>
+      <w:proofErr w:type="spellEnd"/>
+      <w:r>
+        <w:t xml:space="preserve"> </w:t>
+      </w:r>
+      <w:proofErr w:type="spellStart"/>
+      <w:r>
+        <w:rPr>
+          <w:b/>
+        </w:rPr>
+        <w:t>pytest</w:t>
+      </w:r>
+      <w:proofErr w:type="spellEnd"/>
+      <w:r>
+        <w:t xml:space="preserve">. Загалом </w:t>
+      </w:r>
+      <w:proofErr w:type="spellStart"/>
+      <w:r>
+        <w:t>імплементовано</w:t>
+      </w:r>
+      <w:proofErr w:type="spellEnd"/>
+      <w:r>
+        <w:t xml:space="preserve"> 19 тесті</w:t>
+      </w:r>
+      <w:proofErr w:type="gramStart"/>
+      <w:r>
+        <w:t>в</w:t>
+      </w:r>
+      <w:proofErr w:type="gramEnd"/>
+      <w:r>
+        <w:t>, які повністю покривають ключові модулі: авторизацію (</w:t>
+      </w:r>
+      <w:proofErr w:type="spellStart"/>
+      <w:r>
+        <w:t>auth</w:t>
+      </w:r>
+      <w:proofErr w:type="spellEnd"/>
+      <w:r>
+        <w:t>), роботу з обладнанням (</w:t>
+      </w:r>
+      <w:proofErr w:type="spellStart"/>
+      <w:r>
+        <w:t>equipment</w:t>
+      </w:r>
+      <w:proofErr w:type="spellEnd"/>
+      <w:r>
+        <w:t>) та управління симуляцією (</w:t>
+      </w:r>
+      <w:proofErr w:type="spellStart"/>
+      <w:r>
+        <w:t>simulation</w:t>
+      </w:r>
+      <w:proofErr w:type="spellEnd"/>
+      <w:r>
+        <w:t xml:space="preserve">). Для забезпечення ізоляції від виробничого середовища та запобігання втраті даних, тести виконуються у віртуальному середовищі: замість </w:t>
+      </w:r>
+      <w:proofErr w:type="spellStart"/>
+      <w:r>
+        <w:t>PostgreSQL</w:t>
+      </w:r>
+      <w:proofErr w:type="spellEnd"/>
+      <w:r>
+        <w:t xml:space="preserve"> використовується in-</w:t>
+      </w:r>
+      <w:proofErr w:type="spellStart"/>
+      <w:r>
+        <w:t>memory</w:t>
+      </w:r>
+      <w:proofErr w:type="spellEnd"/>
+      <w:r>
+        <w:t xml:space="preserve"> база даних </w:t>
+      </w:r>
+      <w:proofErr w:type="spellStart"/>
+      <w:r>
+        <w:rPr>
+          <w:b/>
+        </w:rPr>
+        <w:t>SQLite</w:t>
+      </w:r>
+      <w:proofErr w:type="spellEnd"/>
+      <w:r>
+        <w:t xml:space="preserve">, а для </w:t>
+      </w:r>
+      <w:proofErr w:type="spellStart"/>
+      <w:r>
+        <w:t>MongoDB</w:t>
+      </w:r>
+      <w:proofErr w:type="spellEnd"/>
+      <w:r>
+        <w:t xml:space="preserve"> застосовано інструмент </w:t>
+      </w:r>
+      <w:proofErr w:type="spellStart"/>
+      <w:r>
+        <w:t>мокування</w:t>
+      </w:r>
+      <w:proofErr w:type="spellEnd"/>
+      <w:r>
+        <w:t xml:space="preserve"> </w:t>
+      </w:r>
+      <w:proofErr w:type="spellStart"/>
+      <w:r>
+        <w:rPr>
+          <w:b/>
+        </w:rPr>
+        <w:t>AsyncMock</w:t>
+      </w:r>
+      <w:proofErr w:type="spellEnd"/>
+      <w:r>
+        <w:t>. Це дозволяє безперервно перевіряти систему безпечно та ефективно.</w:t>
       </w:r>
     </w:p>
     <w:p>
@@ -9883,7 +10506,6 @@
           <w:szCs w:val="28"/>
           <w:lang w:val="uk-UA" w:eastAsia="ru-RU"/>
         </w:rPr>
-        <w:lastRenderedPageBreak/>
         <w:t>7.4. Тестування безпеки (Penetration testing)</w:t>
       </w:r>
     </w:p>
@@ -9940,6 +10562,7 @@
           <w:szCs w:val="28"/>
           <w:lang w:val="uk-UA" w:eastAsia="ru-RU"/>
         </w:rPr>
+        <w:lastRenderedPageBreak/>
         <w:t>Перевірка механізмів авторизації:</w:t>
       </w:r>
       <w:r>
@@ -10308,7 +10931,97 @@
           <w:szCs w:val="28"/>
           <w:lang w:val="uk-UA"/>
         </w:rPr>
-        <w:t xml:space="preserve"> Мікросервіси бекенду та фронтенд розгорнуті в ізольованих Docker-контейнерах під управлінням оркестратора Amazon EKS (</w:t>
+        <w:t xml:space="preserve"> </w:t>
+      </w:r>
+      <w:proofErr w:type="spellStart"/>
+      <w:r>
+        <w:rPr>
+          <w:sz w:val="28"/>
+          <w:szCs w:val="28"/>
+          <w:lang w:val="uk-UA"/>
+        </w:rPr>
+        <w:t>Мікросервіси</w:t>
+      </w:r>
+      <w:proofErr w:type="spellEnd"/>
+      <w:r>
+        <w:rPr>
+          <w:sz w:val="28"/>
+          <w:szCs w:val="28"/>
+          <w:lang w:val="uk-UA"/>
+        </w:rPr>
+        <w:t xml:space="preserve"> </w:t>
+      </w:r>
+      <w:proofErr w:type="spellStart"/>
+      <w:r>
+        <w:rPr>
+          <w:sz w:val="28"/>
+          <w:szCs w:val="28"/>
+          <w:lang w:val="uk-UA"/>
+        </w:rPr>
+        <w:t>бекенду</w:t>
+      </w:r>
+      <w:proofErr w:type="spellEnd"/>
+      <w:r>
+        <w:rPr>
+          <w:sz w:val="28"/>
+          <w:szCs w:val="28"/>
+          <w:lang w:val="uk-UA"/>
+        </w:rPr>
+        <w:t xml:space="preserve"> та </w:t>
+      </w:r>
+      <w:proofErr w:type="spellStart"/>
+      <w:r>
+        <w:rPr>
+          <w:sz w:val="28"/>
+          <w:szCs w:val="28"/>
+          <w:lang w:val="uk-UA"/>
+        </w:rPr>
+        <w:t>фронтенд</w:t>
+      </w:r>
+      <w:proofErr w:type="spellEnd"/>
+      <w:r>
+        <w:rPr>
+          <w:sz w:val="28"/>
+          <w:szCs w:val="28"/>
+          <w:lang w:val="uk-UA"/>
+        </w:rPr>
+        <w:t xml:space="preserve"> розгорнуті в ізольованих Docker-контейнерах під управлінням </w:t>
+      </w:r>
+      <w:proofErr w:type="spellStart"/>
+      <w:r>
+        <w:rPr>
+          <w:sz w:val="28"/>
+          <w:szCs w:val="28"/>
+          <w:lang w:val="uk-UA"/>
+        </w:rPr>
+        <w:t>оркестратора</w:t>
+      </w:r>
+      <w:proofErr w:type="spellEnd"/>
+      <w:r>
+        <w:rPr>
+          <w:sz w:val="28"/>
+          <w:szCs w:val="28"/>
+          <w:lang w:val="uk-UA"/>
+        </w:rPr>
+        <w:t xml:space="preserve"> </w:t>
+      </w:r>
+      <w:proofErr w:type="spellStart"/>
+      <w:r>
+        <w:rPr>
+          <w:sz w:val="28"/>
+          <w:szCs w:val="28"/>
+          <w:lang w:val="uk-UA"/>
+        </w:rPr>
+        <w:t>Amazon</w:t>
+      </w:r>
+      <w:proofErr w:type="spellEnd"/>
+      <w:r>
+        <w:rPr>
+          <w:sz w:val="28"/>
+          <w:szCs w:val="28"/>
+          <w:lang w:val="uk-UA"/>
+        </w:rPr>
+        <w:t xml:space="preserve"> EKS (</w:t>
       </w:r>
       <w:r>
         <w:rPr>
@@ -10316,7 +11029,49 @@
           <w:szCs w:val="28"/>
           <w:lang w:val="en-US"/>
         </w:rPr>
-        <w:t>Elastic Kubernetes Service).</w:t>
+        <w:t>Elastic</w:t>
+      </w:r>
+      <w:r>
+        <w:rPr>
+          <w:sz w:val="28"/>
+          <w:szCs w:val="28"/>
+          <w:lang w:val="uk-UA"/>
+        </w:rPr>
+        <w:t xml:space="preserve"> </w:t>
+      </w:r>
+      <w:proofErr w:type="spellStart"/>
+      <w:r>
+        <w:rPr>
+          <w:sz w:val="28"/>
+          <w:szCs w:val="28"/>
+          <w:lang w:val="en-US"/>
+        </w:rPr>
+        <w:t>Kubernetes</w:t>
+      </w:r>
+      <w:proofErr w:type="spellEnd"/>
+      <w:r>
+        <w:rPr>
+          <w:sz w:val="28"/>
+          <w:szCs w:val="28"/>
+          <w:lang w:val="uk-UA"/>
+        </w:rPr>
+        <w:t xml:space="preserve"> </w:t>
+      </w:r>
+      <w:r>
+        <w:rPr>
+          <w:sz w:val="28"/>
+          <w:szCs w:val="28"/>
+          <w:lang w:val="en-US"/>
+        </w:rPr>
+        <w:t>Service</w:t>
+      </w:r>
+      <w:r>
+        <w:rPr>
+          <w:sz w:val="28"/>
+          <w:szCs w:val="28"/>
+          <w:lang w:val="uk-UA"/>
+        </w:rPr>
+        <w:t>).</w:t>
       </w:r>
     </w:p>
     <w:p>
@@ -10364,6 +11119,21 @@
           <w:tab w:val="left" w:pos="993"/>
         </w:tabs>
         <w:spacing w:before="0" w:beforeAutospacing="0" w:after="0" w:afterAutospacing="0"/>
+        <w:jc w:val="both"/>
+        <w:rPr>
+          <w:sz w:val="28"/>
+          <w:szCs w:val="28"/>
+          <w:lang w:val="uk-UA"/>
+        </w:rPr>
+      </w:pPr>
+    </w:p>
+    <w:p>
+      <w:pPr>
+        <w:pStyle w:val="a3"/>
+        <w:tabs>
+          <w:tab w:val="left" w:pos="993"/>
+        </w:tabs>
+        <w:spacing w:before="0" w:beforeAutospacing="0" w:after="0" w:afterAutospacing="0"/>
         <w:ind w:firstLine="709"/>
         <w:jc w:val="both"/>
         <w:rPr>
@@ -10487,6 +11257,112 @@
     </w:p>
     <w:p>
       <w:pPr>
+        <w:pStyle w:val="ae"/>
+      </w:pPr>
+      <w:r>
+        <w:lastRenderedPageBreak/>
+        <w:t xml:space="preserve">Для автоматизації контролю якості розроблено </w:t>
+      </w:r>
+      <w:proofErr w:type="spellStart"/>
+      <w:r>
+        <w:rPr>
+          <w:lang w:val="ru-RU"/>
+        </w:rPr>
+        <w:t>pipeline</w:t>
+      </w:r>
+      <w:proofErr w:type="spellEnd"/>
+      <w:r>
+        <w:t xml:space="preserve"> у </w:t>
+      </w:r>
+      <w:proofErr w:type="spellStart"/>
+      <w:r>
+        <w:rPr>
+          <w:lang w:val="ru-RU"/>
+        </w:rPr>
+        <w:t>GitHub</w:t>
+      </w:r>
+      <w:proofErr w:type="spellEnd"/>
+      <w:r>
+        <w:t xml:space="preserve"> </w:t>
+      </w:r>
+      <w:proofErr w:type="spellStart"/>
+      <w:r>
+        <w:rPr>
+          <w:lang w:val="ru-RU"/>
+        </w:rPr>
+        <w:t>Actions</w:t>
+      </w:r>
+      <w:proofErr w:type="spellEnd"/>
+      <w:r>
+        <w:t xml:space="preserve">. При кожному </w:t>
+      </w:r>
+      <w:proofErr w:type="spellStart"/>
+      <w:r>
+        <w:rPr>
+          <w:lang w:val="ru-RU"/>
+        </w:rPr>
+        <w:t>push</w:t>
+      </w:r>
+      <w:proofErr w:type="spellEnd"/>
+      <w:r>
+        <w:t xml:space="preserve"> або </w:t>
+      </w:r>
+      <w:proofErr w:type="spellStart"/>
+      <w:r>
+        <w:rPr>
+          <w:lang w:val="ru-RU"/>
+        </w:rPr>
+        <w:t>pull</w:t>
+      </w:r>
+      <w:r>
+        <w:t>-запиті</w:t>
+      </w:r>
+      <w:proofErr w:type="spellEnd"/>
+      <w:r>
+        <w:t xml:space="preserve"> у гілку </w:t>
+      </w:r>
+      <w:proofErr w:type="spellStart"/>
+      <w:r>
+        <w:rPr>
+          <w:b/>
+          <w:lang w:val="ru-RU"/>
+        </w:rPr>
+        <w:t>main</w:t>
+      </w:r>
+      <w:proofErr w:type="spellEnd"/>
+      <w:r>
+        <w:t xml:space="preserve"> система автоматично піднімає оточення, встановлює залежності та запускає </w:t>
+      </w:r>
+      <w:proofErr w:type="spellStart"/>
+      <w:r>
+        <w:rPr>
+          <w:b/>
+          <w:lang w:val="ru-RU"/>
+        </w:rPr>
+        <w:t>pytest</w:t>
+      </w:r>
+      <w:proofErr w:type="spellEnd"/>
+      <w:r>
+        <w:t>.</w:t>
+      </w:r>
+    </w:p>
+    <w:p>
+      <w:pPr>
+        <w:pStyle w:val="a3"/>
+        <w:tabs>
+          <w:tab w:val="left" w:pos="993"/>
+        </w:tabs>
+        <w:spacing w:before="0" w:beforeAutospacing="0" w:after="0" w:afterAutospacing="0"/>
+        <w:jc w:val="both"/>
+        <w:rPr>
+          <w:sz w:val="28"/>
+          <w:szCs w:val="28"/>
+          <w:lang w:val="uk-UA"/>
+        </w:rPr>
+      </w:pPr>
+    </w:p>
+    <w:p>
+      <w:pPr>
         <w:pStyle w:val="a3"/>
         <w:tabs>
           <w:tab w:val="left" w:pos="993"/>
@@ -10508,7 +11384,6 @@
           <w:szCs w:val="28"/>
           <w:lang w:val="uk-UA"/>
         </w:rPr>
-        <w:lastRenderedPageBreak/>
         <w:t>8.3. Впровадження моніторингу та логування (Prometheus та Grafana)</w:t>
       </w:r>
       <w:r>
@@ -10522,96 +11397,70 @@
     </w:p>
     <w:p>
       <w:pPr>
+        <w:pStyle w:val="ae"/>
+      </w:pPr>
+      <w:proofErr w:type="spellStart"/>
+      <w:r>
+        <w:t>Бекенд-додаток</w:t>
+      </w:r>
+      <w:proofErr w:type="spellEnd"/>
+      <w:r>
+        <w:t xml:space="preserve"> </w:t>
+      </w:r>
+      <w:proofErr w:type="spellStart"/>
+      <w:r>
+        <w:t>FastAPI</w:t>
+      </w:r>
+      <w:proofErr w:type="spellEnd"/>
+      <w:r>
+        <w:t xml:space="preserve"> інструментовано за допомогою експортера метрик. У загальній інфраструктурі (через </w:t>
+      </w:r>
+      <w:r>
+        <w:rPr>
+          <w:b/>
+        </w:rPr>
+        <w:t>docker-compose</w:t>
+      </w:r>
+      <w:r>
+        <w:t xml:space="preserve">) розгорнуто сервіси </w:t>
+      </w:r>
+      <w:proofErr w:type="spellStart"/>
+      <w:r>
+        <w:rPr>
+          <w:b/>
+        </w:rPr>
+        <w:t>Prometheus</w:t>
+      </w:r>
+      <w:proofErr w:type="spellEnd"/>
+      <w:r>
+        <w:t xml:space="preserve"> (для збору метрик запитів, помилок та часу відгуку) та </w:t>
+      </w:r>
+      <w:proofErr w:type="spellStart"/>
+      <w:r>
+        <w:rPr>
+          <w:b/>
+        </w:rPr>
+        <w:t>Grafana</w:t>
+      </w:r>
+      <w:proofErr w:type="spellEnd"/>
+      <w:r>
+        <w:t xml:space="preserve"> (для їхньої візуалізації).</w:t>
+      </w:r>
+    </w:p>
+    <w:p>
+      <w:pPr>
         <w:pStyle w:val="a3"/>
-        <w:numPr>
-          <w:ilvl w:val="0"/>
-          <w:numId w:val="34"/>
-        </w:numPr>
         <w:tabs>
           <w:tab w:val="left" w:pos="993"/>
         </w:tabs>
         <w:spacing w:before="0" w:beforeAutospacing="0" w:after="0" w:afterAutospacing="0"/>
-        <w:ind w:left="0" w:firstLine="709"/>
-        <w:jc w:val="both"/>
-        <w:rPr>
-          <w:sz w:val="28"/>
-          <w:szCs w:val="28"/>
-          <w:lang w:val="uk-UA"/>
-        </w:rPr>
-      </w:pPr>
-      <w:r>
-        <w:rPr>
-          <w:b/>
-          <w:bCs/>
-          <w:sz w:val="28"/>
-          <w:szCs w:val="28"/>
-          <w:lang w:val="uk-UA"/>
-        </w:rPr>
-        <w:t>Збір метрик (Prometheus):</w:t>
-      </w:r>
-      <w:r>
-        <w:rPr>
-          <w:sz w:val="28"/>
-          <w:szCs w:val="28"/>
-          <w:lang w:val="uk-UA"/>
-        </w:rPr>
-        <w:t xml:space="preserve"> Налаштовано сервіс Prometheus, який кожні 10 секунд збирає системні метрики з Kubernetes-кластера (завантаження CPU/RAM вузлів, кількість активних підключень до бази даних, частота помилок API).</w:t>
-      </w:r>
-    </w:p>
-    <w:p>
-      <w:pPr>
-        <w:pStyle w:val="a3"/>
-        <w:numPr>
-          <w:ilvl w:val="0"/>
-          <w:numId w:val="34"/>
-        </w:numPr>
-        <w:tabs>
-          <w:tab w:val="left" w:pos="993"/>
-        </w:tabs>
-        <w:spacing w:before="0" w:beforeAutospacing="0" w:after="0" w:afterAutospacing="0"/>
-        <w:ind w:left="0" w:firstLine="709"/>
-        <w:jc w:val="both"/>
-        <w:rPr>
-          <w:sz w:val="28"/>
-          <w:szCs w:val="28"/>
-          <w:lang w:val="uk-UA"/>
-        </w:rPr>
-      </w:pPr>
-      <w:r>
-        <w:rPr>
-          <w:b/>
-          <w:bCs/>
-          <w:sz w:val="28"/>
-          <w:szCs w:val="28"/>
-          <w:lang w:val="uk-UA"/>
-        </w:rPr>
-        <w:t>Візуалізація (Grafana):</w:t>
-      </w:r>
-      <w:r>
-        <w:rPr>
-          <w:sz w:val="28"/>
-          <w:szCs w:val="28"/>
-          <w:lang w:val="uk-UA"/>
-        </w:rPr>
-        <w:t xml:space="preserve"> На базі зібраних даних розгорнуто дашборди в Grafana. Налаштовано систему алертів (Alerting): якщо використання пам'яті мікросервісом </w:t>
-      </w:r>
-      <w:r>
-        <w:rPr>
-          <w:rStyle w:val="HTML"/>
-          <w:sz w:val="28"/>
-          <w:szCs w:val="28"/>
-          <w:lang w:val="uk-UA"/>
-        </w:rPr>
-        <w:t>Data Collector</w:t>
-      </w:r>
-      <w:r>
-        <w:rPr>
-          <w:sz w:val="28"/>
-          <w:szCs w:val="28"/>
-          <w:lang w:val="uk-UA"/>
-        </w:rPr>
-        <w:t xml:space="preserve"> перевищує 85%, DevOps-інженери автоматично отримують сповіщення в корпоративний месенджер.</w:t>
-      </w:r>
+        <w:jc w:val="both"/>
+        <w:rPr>
+          <w:sz w:val="28"/>
+          <w:szCs w:val="28"/>
+          <w:lang w:val="uk-UA"/>
+        </w:rPr>
+      </w:pPr>
     </w:p>
     <w:p>
       <w:pPr>
@@ -10644,7 +11493,17 @@
           <w:szCs w:val="28"/>
           <w:lang w:val="uk-UA"/>
         </w:rPr>
-        <w:t xml:space="preserve"> Для гарантії збереження історичних даних про ІТ-ризики впроваджено стратегію Disaster Recovery.</w:t>
+        <w:t xml:space="preserve"> Для гарантії збереження історичних даних про І</w:t>
+      </w:r>
+      <w:bookmarkStart w:id="0" w:name="_GoBack"/>
+      <w:bookmarkEnd w:id="0"/>
+      <w:r>
+        <w:rPr>
+          <w:sz w:val="28"/>
+          <w:szCs w:val="28"/>
+          <w:lang w:val="uk-UA"/>
+        </w:rPr>
+        <w:t>Т-ризики впроваджено стратегію Disaster Recovery.</w:t>
       </w:r>
     </w:p>
     <w:p>
@@ -10725,6 +11584,272 @@
     </w:p>
     <w:p>
       <w:pPr>
+        <w:pStyle w:val="ae"/>
+      </w:pPr>
+      <w:r>
+        <w:t xml:space="preserve">Створено автоматизовані </w:t>
+      </w:r>
+      <w:proofErr w:type="spellStart"/>
+      <w:r>
+        <w:t>скрипти</w:t>
+      </w:r>
+      <w:proofErr w:type="spellEnd"/>
+      <w:r>
+        <w:t xml:space="preserve"> (</w:t>
+      </w:r>
+      <w:proofErr w:type="spellStart"/>
+      <w:r>
+        <w:rPr>
+          <w:b/>
+          <w:lang w:val="ru-RU"/>
+        </w:rPr>
+        <w:t>backup</w:t>
+      </w:r>
+      <w:proofErr w:type="spellEnd"/>
+      <w:r>
+        <w:rPr>
+          <w:b/>
+        </w:rPr>
+        <w:t>.</w:t>
+      </w:r>
+      <w:proofErr w:type="spellStart"/>
+      <w:r>
+        <w:rPr>
+          <w:b/>
+          <w:lang w:val="ru-RU"/>
+        </w:rPr>
+        <w:t>sh</w:t>
+      </w:r>
+      <w:proofErr w:type="spellEnd"/>
+      <w:r>
+        <w:t xml:space="preserve"> для </w:t>
+      </w:r>
+      <w:proofErr w:type="spellStart"/>
+      <w:r>
+        <w:rPr>
+          <w:lang w:val="ru-RU"/>
+        </w:rPr>
+        <w:t>Linux</w:t>
+      </w:r>
+      <w:proofErr w:type="spellEnd"/>
+      <w:r>
+        <w:t xml:space="preserve"> та </w:t>
+      </w:r>
+      <w:proofErr w:type="spellStart"/>
+      <w:r>
+        <w:rPr>
+          <w:b/>
+          <w:lang w:val="ru-RU"/>
+        </w:rPr>
+        <w:t>backup</w:t>
+      </w:r>
+      <w:proofErr w:type="spellEnd"/>
+      <w:r>
+        <w:rPr>
+          <w:b/>
+        </w:rPr>
+        <w:t>.</w:t>
+      </w:r>
+      <w:proofErr w:type="spellStart"/>
+      <w:r>
+        <w:rPr>
+          <w:b/>
+          <w:lang w:val="ru-RU"/>
+        </w:rPr>
+        <w:t>ps</w:t>
+      </w:r>
+      <w:proofErr w:type="spellEnd"/>
+      <w:r>
+        <w:rPr>
+          <w:b/>
+        </w:rPr>
+        <w:t>1</w:t>
+      </w:r>
+      <w:r>
+        <w:t xml:space="preserve"> для </w:t>
+      </w:r>
+      <w:proofErr w:type="spellStart"/>
+      <w:r>
+        <w:rPr>
+          <w:lang w:val="ru-RU"/>
+        </w:rPr>
+        <w:t>Windows</w:t>
+      </w:r>
+      <w:proofErr w:type="spellEnd"/>
+      <w:r>
+        <w:t xml:space="preserve">), які здійснюють </w:t>
+      </w:r>
+      <w:proofErr w:type="spellStart"/>
+      <w:r>
+        <w:t>дампи</w:t>
+      </w:r>
+      <w:proofErr w:type="spellEnd"/>
+      <w:r>
+        <w:t xml:space="preserve"> баз даних (</w:t>
+      </w:r>
+      <w:proofErr w:type="spellStart"/>
+      <w:r>
+        <w:rPr>
+          <w:b/>
+          <w:lang w:val="ru-RU"/>
+        </w:rPr>
+        <w:t>pg</w:t>
+      </w:r>
+      <w:proofErr w:type="spellEnd"/>
+      <w:r>
+        <w:rPr>
+          <w:b/>
+        </w:rPr>
+        <w:t>_</w:t>
+      </w:r>
+      <w:proofErr w:type="spellStart"/>
+      <w:r>
+        <w:rPr>
+          <w:b/>
+          <w:lang w:val="ru-RU"/>
+        </w:rPr>
+        <w:t>dump</w:t>
+      </w:r>
+      <w:proofErr w:type="spellEnd"/>
+      <w:r>
+        <w:t xml:space="preserve"> та </w:t>
+      </w:r>
+      <w:proofErr w:type="spellStart"/>
+      <w:r>
+        <w:rPr>
+          <w:b/>
+          <w:lang w:val="ru-RU"/>
+        </w:rPr>
+        <w:t>mongodump</w:t>
+      </w:r>
+      <w:proofErr w:type="spellEnd"/>
+      <w:r>
+        <w:t xml:space="preserve">) і створюють архіви з відміткою часу. </w:t>
+      </w:r>
+      <w:proofErr w:type="spellStart"/>
+      <w:r>
+        <w:rPr>
+          <w:lang w:val="ru-RU"/>
+        </w:rPr>
+        <w:t>Скрипти</w:t>
+      </w:r>
+      <w:proofErr w:type="spellEnd"/>
+      <w:r>
+        <w:rPr>
+          <w:lang w:val="ru-RU"/>
+        </w:rPr>
+        <w:t xml:space="preserve"> </w:t>
+      </w:r>
+      <w:proofErr w:type="spellStart"/>
+      <w:r>
+        <w:rPr>
+          <w:lang w:val="ru-RU"/>
+        </w:rPr>
+        <w:t>працюють</w:t>
+      </w:r>
+      <w:proofErr w:type="spellEnd"/>
+      <w:r>
+        <w:rPr>
+          <w:lang w:val="ru-RU"/>
+        </w:rPr>
+        <w:t xml:space="preserve"> </w:t>
+      </w:r>
+      <w:proofErr w:type="spellStart"/>
+      <w:r>
+        <w:rPr>
+          <w:lang w:val="ru-RU"/>
+        </w:rPr>
+        <w:t>із</w:t>
+      </w:r>
+      <w:proofErr w:type="spellEnd"/>
+      <w:r>
+        <w:rPr>
+          <w:lang w:val="ru-RU"/>
+        </w:rPr>
+        <w:t xml:space="preserve"> </w:t>
+      </w:r>
+      <w:proofErr w:type="spellStart"/>
+      <w:r>
+        <w:rPr>
+          <w:lang w:val="ru-RU"/>
+        </w:rPr>
+        <w:t>захищеними</w:t>
+      </w:r>
+      <w:proofErr w:type="spellEnd"/>
+      <w:r>
+        <w:rPr>
+          <w:lang w:val="ru-RU"/>
+        </w:rPr>
+        <w:t xml:space="preserve"> файлами </w:t>
+      </w:r>
+      <w:proofErr w:type="spellStart"/>
+      <w:r>
+        <w:rPr>
+          <w:lang w:val="ru-RU"/>
+        </w:rPr>
+        <w:t>змінних</w:t>
+      </w:r>
+      <w:proofErr w:type="spellEnd"/>
+      <w:r>
+        <w:rPr>
+          <w:lang w:val="ru-RU"/>
+        </w:rPr>
+        <w:t xml:space="preserve"> </w:t>
+      </w:r>
+      <w:proofErr w:type="spellStart"/>
+      <w:r>
+        <w:rPr>
+          <w:lang w:val="ru-RU"/>
+        </w:rPr>
+        <w:t>середовища</w:t>
+      </w:r>
+      <w:proofErr w:type="spellEnd"/>
+      <w:r>
+        <w:rPr>
+          <w:lang w:val="ru-RU"/>
+        </w:rPr>
+        <w:t xml:space="preserve"> </w:t>
+      </w:r>
+      <w:r>
+        <w:rPr>
+          <w:b/>
+          <w:lang w:val="ru-RU"/>
+        </w:rPr>
+        <w:t>.</w:t>
+      </w:r>
+      <w:proofErr w:type="spellStart"/>
+      <w:r>
+        <w:rPr>
+          <w:b/>
+          <w:lang w:val="ru-RU"/>
+        </w:rPr>
+        <w:t>env</w:t>
+      </w:r>
+      <w:proofErr w:type="spellEnd"/>
+      <w:r>
+        <w:rPr>
+          <w:lang w:val="ru-RU"/>
+        </w:rPr>
+        <w:t>.</w:t>
+      </w:r>
+    </w:p>
+    <w:p>
+      <w:pPr>
+        <w:pStyle w:val="a3"/>
+        <w:tabs>
+          <w:tab w:val="left" w:pos="993"/>
+        </w:tabs>
+        <w:spacing w:before="0" w:beforeAutospacing="0" w:after="0" w:afterAutospacing="0"/>
+        <w:jc w:val="both"/>
+        <w:rPr>
+          <w:sz w:val="28"/>
+          <w:szCs w:val="28"/>
+          <w:lang w:val="uk-UA"/>
+        </w:rPr>
+      </w:pPr>
+    </w:p>
+    <w:p>
+      <w:pPr>
         <w:pStyle w:val="a3"/>
         <w:tabs>
           <w:tab w:val="left" w:pos="993"/>
@@ -10871,7 +11996,7 @@
           <w:color w:val="auto"/>
           <w:sz w:val="28"/>
           <w:szCs w:val="28"/>
-          <w:lang w:val="en-US"/>
+          <w:lang w:val="uk-UA"/>
         </w:rPr>
         <w:t xml:space="preserve">1.5. </w:t>
       </w:r>
@@ -10969,6 +12094,7 @@
           <w:szCs w:val="28"/>
           <w:lang w:val="uk-UA"/>
         </w:rPr>
+        <w:lastRenderedPageBreak/>
         <w:t>Проведено глибинний аналіз предметної області, визначено бізнес-цілі (скорочення простоїв обладнання на 30%) та описано ключові сценарії використання (Use Cases) для різних ролей (CISO, Project Manager).</w:t>
       </w:r>
     </w:p>
@@ -11053,7 +12179,6 @@
           <w:szCs w:val="28"/>
           <w:lang w:val="uk-UA"/>
         </w:rPr>
-        <w:lastRenderedPageBreak/>
         <w:t>Створено захищений RESTful API з використанням JWT-</w:t>
       </w:r>
       <w:proofErr w:type="spellStart"/>
@@ -11371,17 +12496,7 @@
           <w:szCs w:val="28"/>
           <w:lang w:val="uk-UA"/>
         </w:rPr>
-        <w:t xml:space="preserve"> (2nd ed</w:t>
-      </w:r>
-      <w:bookmarkStart w:id="0" w:name="_GoBack"/>
-      <w:bookmarkEnd w:id="0"/>
-      <w:r>
-        <w:rPr>
-          <w:sz w:val="28"/>
-          <w:szCs w:val="28"/>
-          <w:lang w:val="uk-UA"/>
-        </w:rPr>
-        <w:t>.). O'Reilly Media.</w:t>
+        <w:t xml:space="preserve"> (2nd ed.). O'Reilly Media.</w:t>
       </w:r>
     </w:p>
     <w:p>
@@ -11442,7 +12557,7 @@
       <w:hyperlink r:id="rId11" w:tgtFrame="_blank" w:history="1">
         <w:r>
           <w:rPr>
-            <w:rStyle w:val="ac"/>
+            <w:rStyle w:val="ad"/>
             <w:sz w:val="28"/>
             <w:szCs w:val="28"/>
             <w:lang w:val="uk-UA"/>
@@ -11481,7 +12596,7 @@
       <w:hyperlink r:id="rId12" w:tgtFrame="_blank" w:history="1">
         <w:r>
           <w:rPr>
-            <w:rStyle w:val="ac"/>
+            <w:rStyle w:val="ad"/>
             <w:sz w:val="28"/>
             <w:szCs w:val="28"/>
             <w:lang w:val="uk-UA"/>
@@ -11558,7 +12673,7 @@
     <w:sdtContent>
       <w:p>
         <w:pPr>
-          <w:pStyle w:val="a6"/>
+          <w:pStyle w:val="a7"/>
           <w:jc w:val="right"/>
         </w:pPr>
         <w:r>
@@ -11584,7 +12699,7 @@
   </w:sdt>
   <w:p>
     <w:pPr>
-      <w:pStyle w:val="a6"/>
+      <w:pStyle w:val="a7"/>
     </w:pPr>
   </w:p>
 </w:ftr>
@@ -12440,6 +13555,155 @@
     </w:lvl>
   </w:abstractNum>
   <w:abstractNum w:abstractNumId="6">
+    <w:nsid w:val="18C621FE"/>
+    <w:multiLevelType w:val="multilevel"/>
+    <w:tmpl w:val="470869DA"/>
+    <w:lvl w:ilvl="0">
+      <w:start w:val="1"/>
+      <w:numFmt w:val="bullet"/>
+      <w:lvlText w:val=""/>
+      <w:lvlJc w:val="left"/>
+      <w:pPr>
+        <w:tabs>
+          <w:tab w:val="num" w:pos="720"/>
+        </w:tabs>
+        <w:ind w:left="720" w:hanging="360"/>
+      </w:pPr>
+      <w:rPr>
+        <w:rFonts w:ascii="Symbol" w:hAnsi="Symbol" w:hint="default"/>
+        <w:sz w:val="20"/>
+      </w:rPr>
+    </w:lvl>
+    <w:lvl w:ilvl="1" w:tentative="1">
+      <w:start w:val="1"/>
+      <w:numFmt w:val="bullet"/>
+      <w:lvlText w:val="o"/>
+      <w:lvlJc w:val="left"/>
+      <w:pPr>
+        <w:tabs>
+          <w:tab w:val="num" w:pos="1440"/>
+        </w:tabs>
+        <w:ind w:left="1440" w:hanging="360"/>
+      </w:pPr>
+      <w:rPr>
+        <w:rFonts w:ascii="Courier New" w:hAnsi="Courier New" w:hint="default"/>
+        <w:sz w:val="20"/>
+      </w:rPr>
+    </w:lvl>
+    <w:lvl w:ilvl="2" w:tentative="1">
+      <w:start w:val="1"/>
+      <w:numFmt w:val="bullet"/>
+      <w:lvlText w:val=""/>
+      <w:lvlJc w:val="left"/>
+      <w:pPr>
+        <w:tabs>
+          <w:tab w:val="num" w:pos="2160"/>
+        </w:tabs>
+        <w:ind w:left="2160" w:hanging="360"/>
+      </w:pPr>
+      <w:rPr>
+        <w:rFonts w:ascii="Wingdings" w:hAnsi="Wingdings" w:hint="default"/>
+        <w:sz w:val="20"/>
+      </w:rPr>
+    </w:lvl>
+    <w:lvl w:ilvl="3" w:tentative="1">
+      <w:start w:val="1"/>
+      <w:numFmt w:val="bullet"/>
+      <w:lvlText w:val=""/>
+      <w:lvlJc w:val="left"/>
+      <w:pPr>
+        <w:tabs>
+          <w:tab w:val="num" w:pos="2880"/>
+        </w:tabs>
+        <w:ind w:left="2880" w:hanging="360"/>
+      </w:pPr>
+      <w:rPr>
+        <w:rFonts w:ascii="Wingdings" w:hAnsi="Wingdings" w:hint="default"/>
+        <w:sz w:val="20"/>
+      </w:rPr>
+    </w:lvl>
+    <w:lvl w:ilvl="4" w:tentative="1">
+      <w:start w:val="1"/>
+      <w:numFmt w:val="bullet"/>
+      <w:lvlText w:val=""/>
+      <w:lvlJc w:val="left"/>
+      <w:pPr>
+        <w:tabs>
+          <w:tab w:val="num" w:pos="3600"/>
+        </w:tabs>
+        <w:ind w:left="3600" w:hanging="360"/>
+      </w:pPr>
+      <w:rPr>
+        <w:rFonts w:ascii="Wingdings" w:hAnsi="Wingdings" w:hint="default"/>
+        <w:sz w:val="20"/>
+      </w:rPr>
+    </w:lvl>
+    <w:lvl w:ilvl="5" w:tentative="1">
+      <w:start w:val="1"/>
+      <w:numFmt w:val="bullet"/>
+      <w:lvlText w:val=""/>
+      <w:lvlJc w:val="left"/>
+      <w:pPr>
+        <w:tabs>
+          <w:tab w:val="num" w:pos="4320"/>
+        </w:tabs>
+        <w:ind w:left="4320" w:hanging="360"/>
+      </w:pPr>
+      <w:rPr>
+        <w:rFonts w:ascii="Wingdings" w:hAnsi="Wingdings" w:hint="default"/>
+        <w:sz w:val="20"/>
+      </w:rPr>
+    </w:lvl>
+    <w:lvl w:ilvl="6" w:tentative="1">
+      <w:start w:val="1"/>
+      <w:numFmt w:val="bullet"/>
+      <w:lvlText w:val=""/>
+      <w:lvlJc w:val="left"/>
+      <w:pPr>
+        <w:tabs>
+          <w:tab w:val="num" w:pos="5040"/>
+        </w:tabs>
+        <w:ind w:left="5040" w:hanging="360"/>
+      </w:pPr>
+      <w:rPr>
+        <w:rFonts w:ascii="Wingdings" w:hAnsi="Wingdings" w:hint="default"/>
+        <w:sz w:val="20"/>
+      </w:rPr>
+    </w:lvl>
+    <w:lvl w:ilvl="7" w:tentative="1">
+      <w:start w:val="1"/>
+      <w:numFmt w:val="bullet"/>
+      <w:lvlText w:val=""/>
+      <w:lvlJc w:val="left"/>
+      <w:pPr>
+        <w:tabs>
+          <w:tab w:val="num" w:pos="5760"/>
+        </w:tabs>
+        <w:ind w:left="5760" w:hanging="360"/>
+      </w:pPr>
+      <w:rPr>
+        <w:rFonts w:ascii="Wingdings" w:hAnsi="Wingdings" w:hint="default"/>
+        <w:sz w:val="20"/>
+      </w:rPr>
+    </w:lvl>
+    <w:lvl w:ilvl="8" w:tentative="1">
+      <w:start w:val="1"/>
+      <w:numFmt w:val="bullet"/>
+      <w:lvlText w:val=""/>
+      <w:lvlJc w:val="left"/>
+      <w:pPr>
+        <w:tabs>
+          <w:tab w:val="num" w:pos="6480"/>
+        </w:tabs>
+        <w:ind w:left="6480" w:hanging="360"/>
+      </w:pPr>
+      <w:rPr>
+        <w:rFonts w:ascii="Wingdings" w:hAnsi="Wingdings" w:hint="default"/>
+        <w:sz w:val="20"/>
+      </w:rPr>
+    </w:lvl>
+  </w:abstractNum>
+  <w:abstractNum w:abstractNumId="7">
     <w:nsid w:val="1C3A2659"/>
     <w:multiLevelType w:val="multilevel"/>
     <w:tmpl w:val="B4EE7B78"/>
@@ -12588,7 +13852,7 @@
       </w:rPr>
     </w:lvl>
   </w:abstractNum>
-  <w:abstractNum w:abstractNumId="7">
+  <w:abstractNum w:abstractNumId="8">
     <w:nsid w:val="1F2751AE"/>
     <w:multiLevelType w:val="multilevel"/>
     <w:tmpl w:val="8724F6E4"/>
@@ -12737,7 +14001,7 @@
       </w:rPr>
     </w:lvl>
   </w:abstractNum>
-  <w:abstractNum w:abstractNumId="8">
+  <w:abstractNum w:abstractNumId="9">
     <w:nsid w:val="210F776D"/>
     <w:multiLevelType w:val="multilevel"/>
     <w:tmpl w:val="C8DAF2AA"/>
@@ -12886,7 +14150,7 @@
       </w:rPr>
     </w:lvl>
   </w:abstractNum>
-  <w:abstractNum w:abstractNumId="9">
+  <w:abstractNum w:abstractNumId="10">
     <w:nsid w:val="2771565A"/>
     <w:multiLevelType w:val="multilevel"/>
     <w:tmpl w:val="0F64B444"/>
@@ -13035,7 +14299,7 @@
       </w:rPr>
     </w:lvl>
   </w:abstractNum>
-  <w:abstractNum w:abstractNumId="10">
+  <w:abstractNum w:abstractNumId="11">
     <w:nsid w:val="30B420D2"/>
     <w:multiLevelType w:val="multilevel"/>
     <w:tmpl w:val="C60C58E8"/>
@@ -13184,7 +14448,7 @@
       </w:rPr>
     </w:lvl>
   </w:abstractNum>
-  <w:abstractNum w:abstractNumId="11">
+  <w:abstractNum w:abstractNumId="12">
     <w:nsid w:val="32337F9D"/>
     <w:multiLevelType w:val="multilevel"/>
     <w:tmpl w:val="1F42AD34"/>
@@ -13333,7 +14597,7 @@
       </w:rPr>
     </w:lvl>
   </w:abstractNum>
-  <w:abstractNum w:abstractNumId="12">
+  <w:abstractNum w:abstractNumId="13">
     <w:nsid w:val="33114A90"/>
     <w:multiLevelType w:val="multilevel"/>
     <w:tmpl w:val="8D684F24"/>
@@ -13482,7 +14746,7 @@
       </w:rPr>
     </w:lvl>
   </w:abstractNum>
-  <w:abstractNum w:abstractNumId="13">
+  <w:abstractNum w:abstractNumId="14">
     <w:nsid w:val="37294B87"/>
     <w:multiLevelType w:val="multilevel"/>
     <w:tmpl w:val="958209D4"/>
@@ -13631,7 +14895,7 @@
       </w:rPr>
     </w:lvl>
   </w:abstractNum>
-  <w:abstractNum w:abstractNumId="14">
+  <w:abstractNum w:abstractNumId="15">
     <w:nsid w:val="388A3729"/>
     <w:multiLevelType w:val="multilevel"/>
     <w:tmpl w:val="BAD4D8DC"/>
@@ -13780,7 +15044,7 @@
       </w:rPr>
     </w:lvl>
   </w:abstractNum>
-  <w:abstractNum w:abstractNumId="15">
+  <w:abstractNum w:abstractNumId="16">
     <w:nsid w:val="3C62350C"/>
     <w:multiLevelType w:val="multilevel"/>
     <w:tmpl w:val="7A4C488E"/>
@@ -13929,7 +15193,7 @@
       </w:rPr>
     </w:lvl>
   </w:abstractNum>
-  <w:abstractNum w:abstractNumId="16">
+  <w:abstractNum w:abstractNumId="17">
     <w:nsid w:val="3D273E11"/>
     <w:multiLevelType w:val="multilevel"/>
     <w:tmpl w:val="CBD2D220"/>
@@ -14078,7 +15342,7 @@
       </w:rPr>
     </w:lvl>
   </w:abstractNum>
-  <w:abstractNum w:abstractNumId="17">
+  <w:abstractNum w:abstractNumId="18">
     <w:nsid w:val="3D8020E6"/>
     <w:multiLevelType w:val="multilevel"/>
     <w:tmpl w:val="8E389A60"/>
@@ -14227,7 +15491,7 @@
       </w:rPr>
     </w:lvl>
   </w:abstractNum>
-  <w:abstractNum w:abstractNumId="18">
+  <w:abstractNum w:abstractNumId="19">
     <w:nsid w:val="40246E25"/>
     <w:multiLevelType w:val="multilevel"/>
     <w:tmpl w:val="90DCF3DE"/>
@@ -14376,7 +15640,7 @@
       </w:rPr>
     </w:lvl>
   </w:abstractNum>
-  <w:abstractNum w:abstractNumId="19">
+  <w:abstractNum w:abstractNumId="20">
     <w:nsid w:val="42F31838"/>
     <w:multiLevelType w:val="multilevel"/>
     <w:tmpl w:val="A40E2FB4"/>
@@ -14525,7 +15789,7 @@
       </w:rPr>
     </w:lvl>
   </w:abstractNum>
-  <w:abstractNum w:abstractNumId="20">
+  <w:abstractNum w:abstractNumId="21">
     <w:nsid w:val="44A5257E"/>
     <w:multiLevelType w:val="multilevel"/>
     <w:tmpl w:val="3CEA5B10"/>
@@ -14674,7 +15938,7 @@
       </w:rPr>
     </w:lvl>
   </w:abstractNum>
-  <w:abstractNum w:abstractNumId="21">
+  <w:abstractNum w:abstractNumId="22">
     <w:nsid w:val="480656E9"/>
     <w:multiLevelType w:val="multilevel"/>
     <w:tmpl w:val="02E68A1A"/>
@@ -14788,7 +16052,7 @@
       </w:rPr>
     </w:lvl>
   </w:abstractNum>
-  <w:abstractNum w:abstractNumId="22">
+  <w:abstractNum w:abstractNumId="23">
     <w:nsid w:val="4B680A03"/>
     <w:multiLevelType w:val="multilevel"/>
     <w:tmpl w:val="79900FDA"/>
@@ -14937,7 +16201,156 @@
       </w:rPr>
     </w:lvl>
   </w:abstractNum>
-  <w:abstractNum w:abstractNumId="23">
+  <w:abstractNum w:abstractNumId="24">
+    <w:nsid w:val="4DB84FB8"/>
+    <w:multiLevelType w:val="multilevel"/>
+    <w:tmpl w:val="470869DA"/>
+    <w:lvl w:ilvl="0">
+      <w:start w:val="1"/>
+      <w:numFmt w:val="bullet"/>
+      <w:lvlText w:val=""/>
+      <w:lvlJc w:val="left"/>
+      <w:pPr>
+        <w:tabs>
+          <w:tab w:val="num" w:pos="720"/>
+        </w:tabs>
+        <w:ind w:left="720" w:hanging="360"/>
+      </w:pPr>
+      <w:rPr>
+        <w:rFonts w:ascii="Symbol" w:hAnsi="Symbol" w:hint="default"/>
+        <w:sz w:val="20"/>
+      </w:rPr>
+    </w:lvl>
+    <w:lvl w:ilvl="1" w:tentative="1">
+      <w:start w:val="1"/>
+      <w:numFmt w:val="bullet"/>
+      <w:lvlText w:val="o"/>
+      <w:lvlJc w:val="left"/>
+      <w:pPr>
+        <w:tabs>
+          <w:tab w:val="num" w:pos="1440"/>
+        </w:tabs>
+        <w:ind w:left="1440" w:hanging="360"/>
+      </w:pPr>
+      <w:rPr>
+        <w:rFonts w:ascii="Courier New" w:hAnsi="Courier New" w:hint="default"/>
+        <w:sz w:val="20"/>
+      </w:rPr>
+    </w:lvl>
+    <w:lvl w:ilvl="2" w:tentative="1">
+      <w:start w:val="1"/>
+      <w:numFmt w:val="bullet"/>
+      <w:lvlText w:val=""/>
+      <w:lvlJc w:val="left"/>
+      <w:pPr>
+        <w:tabs>
+          <w:tab w:val="num" w:pos="2160"/>
+        </w:tabs>
+        <w:ind w:left="2160" w:hanging="360"/>
+      </w:pPr>
+      <w:rPr>
+        <w:rFonts w:ascii="Wingdings" w:hAnsi="Wingdings" w:hint="default"/>
+        <w:sz w:val="20"/>
+      </w:rPr>
+    </w:lvl>
+    <w:lvl w:ilvl="3" w:tentative="1">
+      <w:start w:val="1"/>
+      <w:numFmt w:val="bullet"/>
+      <w:lvlText w:val=""/>
+      <w:lvlJc w:val="left"/>
+      <w:pPr>
+        <w:tabs>
+          <w:tab w:val="num" w:pos="2880"/>
+        </w:tabs>
+        <w:ind w:left="2880" w:hanging="360"/>
+      </w:pPr>
+      <w:rPr>
+        <w:rFonts w:ascii="Wingdings" w:hAnsi="Wingdings" w:hint="default"/>
+        <w:sz w:val="20"/>
+      </w:rPr>
+    </w:lvl>
+    <w:lvl w:ilvl="4" w:tentative="1">
+      <w:start w:val="1"/>
+      <w:numFmt w:val="bullet"/>
+      <w:lvlText w:val=""/>
+      <w:lvlJc w:val="left"/>
+      <w:pPr>
+        <w:tabs>
+          <w:tab w:val="num" w:pos="3600"/>
+        </w:tabs>
+        <w:ind w:left="3600" w:hanging="360"/>
+      </w:pPr>
+      <w:rPr>
+        <w:rFonts w:ascii="Wingdings" w:hAnsi="Wingdings" w:hint="default"/>
+        <w:sz w:val="20"/>
+      </w:rPr>
+    </w:lvl>
+    <w:lvl w:ilvl="5" w:tentative="1">
+      <w:start w:val="1"/>
+      <w:numFmt w:val="bullet"/>
+      <w:lvlText w:val=""/>
+      <w:lvlJc w:val="left"/>
+      <w:pPr>
+        <w:tabs>
+          <w:tab w:val="num" w:pos="4320"/>
+        </w:tabs>
+        <w:ind w:left="4320" w:hanging="360"/>
+      </w:pPr>
+      <w:rPr>
+        <w:rFonts w:ascii="Wingdings" w:hAnsi="Wingdings" w:hint="default"/>
+        <w:sz w:val="20"/>
+      </w:rPr>
+    </w:lvl>
+    <w:lvl w:ilvl="6" w:tentative="1">
+      <w:start w:val="1"/>
+      <w:numFmt w:val="bullet"/>
+      <w:lvlText w:val=""/>
+      <w:lvlJc w:val="left"/>
+      <w:pPr>
+        <w:tabs>
+          <w:tab w:val="num" w:pos="5040"/>
+        </w:tabs>
+        <w:ind w:left="5040" w:hanging="360"/>
+      </w:pPr>
+      <w:rPr>
+        <w:rFonts w:ascii="Wingdings" w:hAnsi="Wingdings" w:hint="default"/>
+        <w:sz w:val="20"/>
+      </w:rPr>
+    </w:lvl>
+    <w:lvl w:ilvl="7" w:tentative="1">
+      <w:start w:val="1"/>
+      <w:numFmt w:val="bullet"/>
+      <w:lvlText w:val=""/>
+      <w:lvlJc w:val="left"/>
+      <w:pPr>
+        <w:tabs>
+          <w:tab w:val="num" w:pos="5760"/>
+        </w:tabs>
+        <w:ind w:left="5760" w:hanging="360"/>
+      </w:pPr>
+      <w:rPr>
+        <w:rFonts w:ascii="Wingdings" w:hAnsi="Wingdings" w:hint="default"/>
+        <w:sz w:val="20"/>
+      </w:rPr>
+    </w:lvl>
+    <w:lvl w:ilvl="8" w:tentative="1">
+      <w:start w:val="1"/>
+      <w:numFmt w:val="bullet"/>
+      <w:lvlText w:val=""/>
+      <w:lvlJc w:val="left"/>
+      <w:pPr>
+        <w:tabs>
+          <w:tab w:val="num" w:pos="6480"/>
+        </w:tabs>
+        <w:ind w:left="6480" w:hanging="360"/>
+      </w:pPr>
+      <w:rPr>
+        <w:rFonts w:ascii="Wingdings" w:hAnsi="Wingdings" w:hint="default"/>
+        <w:sz w:val="20"/>
+      </w:rPr>
+    </w:lvl>
+  </w:abstractNum>
+  <w:abstractNum w:abstractNumId="25">
     <w:nsid w:val="4E4750B7"/>
     <w:multiLevelType w:val="multilevel"/>
     <w:tmpl w:val="870664F2"/>
@@ -15050,7 +16463,7 @@
       </w:pPr>
     </w:lvl>
   </w:abstractNum>
-  <w:abstractNum w:abstractNumId="24">
+  <w:abstractNum w:abstractNumId="26">
     <w:nsid w:val="56890310"/>
     <w:multiLevelType w:val="multilevel"/>
     <w:tmpl w:val="4A66A91A"/>
@@ -15199,7 +16612,7 @@
       </w:rPr>
     </w:lvl>
   </w:abstractNum>
-  <w:abstractNum w:abstractNumId="25">
+  <w:abstractNum w:abstractNumId="27">
     <w:nsid w:val="56A2552F"/>
     <w:multiLevelType w:val="multilevel"/>
     <w:tmpl w:val="60181420"/>
@@ -15348,7 +16761,7 @@
       </w:rPr>
     </w:lvl>
   </w:abstractNum>
-  <w:abstractNum w:abstractNumId="26">
+  <w:abstractNum w:abstractNumId="28">
     <w:nsid w:val="5CE74D7D"/>
     <w:multiLevelType w:val="multilevel"/>
     <w:tmpl w:val="0E505B02"/>
@@ -15497,7 +16910,7 @@
       </w:rPr>
     </w:lvl>
   </w:abstractNum>
-  <w:abstractNum w:abstractNumId="27">
+  <w:abstractNum w:abstractNumId="29">
     <w:nsid w:val="5FE35DE0"/>
     <w:multiLevelType w:val="multilevel"/>
     <w:tmpl w:val="6EB49292"/>
@@ -15646,7 +17059,7 @@
       </w:rPr>
     </w:lvl>
   </w:abstractNum>
-  <w:abstractNum w:abstractNumId="28">
+  <w:abstractNum w:abstractNumId="30">
     <w:nsid w:val="66F62918"/>
     <w:multiLevelType w:val="multilevel"/>
     <w:tmpl w:val="8B3CF102"/>
@@ -15759,7 +17172,7 @@
       </w:pPr>
     </w:lvl>
   </w:abstractNum>
-  <w:abstractNum w:abstractNumId="29">
+  <w:abstractNum w:abstractNumId="31">
     <w:nsid w:val="6806725A"/>
     <w:multiLevelType w:val="multilevel"/>
     <w:tmpl w:val="6BD0A756"/>
@@ -15872,7 +17285,7 @@
       </w:pPr>
     </w:lvl>
   </w:abstractNum>
-  <w:abstractNum w:abstractNumId="30">
+  <w:abstractNum w:abstractNumId="32">
     <w:nsid w:val="6E201201"/>
     <w:multiLevelType w:val="multilevel"/>
     <w:tmpl w:val="EDAC9B8A"/>
@@ -16021,7 +17434,7 @@
       </w:rPr>
     </w:lvl>
   </w:abstractNum>
-  <w:abstractNum w:abstractNumId="31">
+  <w:abstractNum w:abstractNumId="33">
     <w:nsid w:val="6E226EEA"/>
     <w:multiLevelType w:val="multilevel"/>
     <w:tmpl w:val="C1D0C774"/>
@@ -16170,7 +17583,7 @@
       </w:rPr>
     </w:lvl>
   </w:abstractNum>
-  <w:abstractNum w:abstractNumId="32">
+  <w:abstractNum w:abstractNumId="34">
     <w:nsid w:val="706C3DB5"/>
     <w:multiLevelType w:val="multilevel"/>
     <w:tmpl w:val="FF109052"/>
@@ -16319,7 +17732,7 @@
       </w:rPr>
     </w:lvl>
   </w:abstractNum>
-  <w:abstractNum w:abstractNumId="33">
+  <w:abstractNum w:abstractNumId="35">
     <w:nsid w:val="70A41A8B"/>
     <w:multiLevelType w:val="multilevel"/>
     <w:tmpl w:val="FE78FAF8"/>
@@ -16441,7 +17854,7 @@
       </w:rPr>
     </w:lvl>
   </w:abstractNum>
-  <w:abstractNum w:abstractNumId="34">
+  <w:abstractNum w:abstractNumId="36">
     <w:nsid w:val="71C71FF8"/>
     <w:multiLevelType w:val="multilevel"/>
     <w:tmpl w:val="23F00B60"/>
@@ -16554,7 +17967,7 @@
       </w:pPr>
     </w:lvl>
   </w:abstractNum>
-  <w:abstractNum w:abstractNumId="35">
+  <w:abstractNum w:abstractNumId="37">
     <w:nsid w:val="749F416D"/>
     <w:multiLevelType w:val="multilevel"/>
     <w:tmpl w:val="470869DA"/>
@@ -16703,7 +18116,7 @@
       </w:rPr>
     </w:lvl>
   </w:abstractNum>
-  <w:abstractNum w:abstractNumId="36">
+  <w:abstractNum w:abstractNumId="38">
     <w:nsid w:val="74AF2296"/>
     <w:multiLevelType w:val="multilevel"/>
     <w:tmpl w:val="1896A636"/>
@@ -16852,7 +18265,7 @@
       </w:rPr>
     </w:lvl>
   </w:abstractNum>
-  <w:abstractNum w:abstractNumId="37">
+  <w:abstractNum w:abstractNumId="39">
     <w:nsid w:val="7627182D"/>
     <w:multiLevelType w:val="multilevel"/>
     <w:tmpl w:val="766208F2"/>
@@ -17002,118 +18415,124 @@
     </w:lvl>
   </w:abstractNum>
   <w:num w:numId="1">
-    <w:abstractNumId w:val="21"/>
+    <w:abstractNumId w:val="22"/>
   </w:num>
   <w:num w:numId="2">
-    <w:abstractNumId w:val="14"/>
+    <w:abstractNumId w:val="15"/>
   </w:num>
   <w:num w:numId="3">
     <w:abstractNumId w:val="0"/>
   </w:num>
   <w:num w:numId="4">
-    <w:abstractNumId w:val="28"/>
+    <w:abstractNumId w:val="30"/>
   </w:num>
   <w:num w:numId="5">
-    <w:abstractNumId w:val="10"/>
+    <w:abstractNumId w:val="11"/>
   </w:num>
   <w:num w:numId="6">
-    <w:abstractNumId w:val="6"/>
+    <w:abstractNumId w:val="7"/>
   </w:num>
   <w:num w:numId="7">
-    <w:abstractNumId w:val="35"/>
+    <w:abstractNumId w:val="37"/>
   </w:num>
   <w:num w:numId="8">
-    <w:abstractNumId w:val="8"/>
+    <w:abstractNumId w:val="9"/>
   </w:num>
   <w:num w:numId="9">
     <w:abstractNumId w:val="5"/>
   </w:num>
   <w:num w:numId="10">
-    <w:abstractNumId w:val="33"/>
+    <w:abstractNumId w:val="35"/>
   </w:num>
   <w:num w:numId="11">
-    <w:abstractNumId w:val="29"/>
+    <w:abstractNumId w:val="31"/>
   </w:num>
   <w:num w:numId="12">
     <w:abstractNumId w:val="1"/>
   </w:num>
   <w:num w:numId="13">
-    <w:abstractNumId w:val="15"/>
+    <w:abstractNumId w:val="16"/>
   </w:num>
   <w:num w:numId="14">
-    <w:abstractNumId w:val="27"/>
+    <w:abstractNumId w:val="29"/>
   </w:num>
   <w:num w:numId="15">
-    <w:abstractNumId w:val="31"/>
+    <w:abstractNumId w:val="33"/>
   </w:num>
   <w:num w:numId="16">
-    <w:abstractNumId w:val="7"/>
+    <w:abstractNumId w:val="8"/>
   </w:num>
   <w:num w:numId="17">
-    <w:abstractNumId w:val="9"/>
+    <w:abstractNumId w:val="10"/>
   </w:num>
   <w:num w:numId="18">
     <w:abstractNumId w:val="3"/>
   </w:num>
   <w:num w:numId="19">
-    <w:abstractNumId w:val="20"/>
+    <w:abstractNumId w:val="21"/>
   </w:num>
   <w:num w:numId="20">
-    <w:abstractNumId w:val="37"/>
+    <w:abstractNumId w:val="39"/>
   </w:num>
   <w:num w:numId="21">
-    <w:abstractNumId w:val="13"/>
+    <w:abstractNumId w:val="14"/>
   </w:num>
   <w:num w:numId="22">
-    <w:abstractNumId w:val="16"/>
+    <w:abstractNumId w:val="17"/>
   </w:num>
   <w:num w:numId="23">
-    <w:abstractNumId w:val="23"/>
+    <w:abstractNumId w:val="25"/>
   </w:num>
   <w:num w:numId="24">
-    <w:abstractNumId w:val="11"/>
+    <w:abstractNumId w:val="12"/>
   </w:num>
   <w:num w:numId="25">
     <w:abstractNumId w:val="2"/>
   </w:num>
   <w:num w:numId="26">
-    <w:abstractNumId w:val="24"/>
+    <w:abstractNumId w:val="26"/>
   </w:num>
   <w:num w:numId="27">
-    <w:abstractNumId w:val="25"/>
+    <w:abstractNumId w:val="27"/>
   </w:num>
   <w:num w:numId="28">
-    <w:abstractNumId w:val="22"/>
+    <w:abstractNumId w:val="23"/>
   </w:num>
   <w:num w:numId="29">
-    <w:abstractNumId w:val="12"/>
+    <w:abstractNumId w:val="13"/>
   </w:num>
   <w:num w:numId="30">
+    <w:abstractNumId w:val="20"/>
+  </w:num>
+  <w:num w:numId="31">
     <w:abstractNumId w:val="19"/>
   </w:num>
-  <w:num w:numId="31">
+  <w:num w:numId="32">
+    <w:abstractNumId w:val="28"/>
+  </w:num>
+  <w:num w:numId="33">
+    <w:abstractNumId w:val="32"/>
+  </w:num>
+  <w:num w:numId="34">
     <w:abstractNumId w:val="18"/>
   </w:num>
-  <w:num w:numId="32">
-    <w:abstractNumId w:val="26"/>
-  </w:num>
-  <w:num w:numId="33">
-    <w:abstractNumId w:val="30"/>
-  </w:num>
-  <w:num w:numId="34">
-    <w:abstractNumId w:val="17"/>
-  </w:num>
   <w:num w:numId="35">
-    <w:abstractNumId w:val="36"/>
+    <w:abstractNumId w:val="38"/>
   </w:num>
   <w:num w:numId="36">
-    <w:abstractNumId w:val="32"/>
+    <w:abstractNumId w:val="34"/>
   </w:num>
   <w:num w:numId="37">
     <w:abstractNumId w:val="4"/>
   </w:num>
   <w:num w:numId="38">
-    <w:abstractNumId w:val="34"/>
+    <w:abstractNumId w:val="36"/>
+  </w:num>
+  <w:num w:numId="39">
+    <w:abstractNumId w:val="24"/>
+  </w:num>
+  <w:num w:numId="40">
+    <w:abstractNumId w:val="6"/>
   </w:num>
   <w:numIdMacAtCleanup w:val="38"/>
 </w:numbering>
@@ -17327,7 +18746,6 @@
   <w:style w:type="character" w:default="1" w:styleId="a0">
     <w:name w:val="Default Paragraph Font"/>
     <w:uiPriority w:val="1"/>
-    <w:semiHidden/>
     <w:unhideWhenUsed/>
   </w:style>
   <w:style w:type="table" w:default="1" w:styleId="a1">
@@ -17354,6 +18772,7 @@
   <w:style w:type="paragraph" w:styleId="a3">
     <w:name w:val="Normal (Web)"/>
     <w:basedOn w:val="a"/>
+    <w:link w:val="a4"/>
     <w:uiPriority w:val="99"/>
     <w:unhideWhenUsed/>
     <w:rsid w:val="007566DD"/>
@@ -17367,10 +18786,10 @@
       <w:lang w:eastAsia="ru-RU"/>
     </w:rPr>
   </w:style>
-  <w:style w:type="paragraph" w:styleId="a4">
+  <w:style w:type="paragraph" w:styleId="a5">
     <w:name w:val="header"/>
     <w:basedOn w:val="a"/>
-    <w:link w:val="a5"/>
+    <w:link w:val="a6"/>
     <w:uiPriority w:val="99"/>
     <w:unhideWhenUsed/>
     <w:rsid w:val="009F185D"/>
@@ -17382,17 +18801,17 @@
       <w:spacing w:after="0" w:line="240" w:lineRule="auto"/>
     </w:pPr>
   </w:style>
-  <w:style w:type="character" w:customStyle="1" w:styleId="a5">
+  <w:style w:type="character" w:customStyle="1" w:styleId="a6">
     <w:name w:val="Верхний колонтитул Знак"/>
     <w:basedOn w:val="a0"/>
-    <w:link w:val="a4"/>
+    <w:link w:val="a5"/>
     <w:uiPriority w:val="99"/>
     <w:rsid w:val="009F185D"/>
   </w:style>
-  <w:style w:type="paragraph" w:styleId="a6">
+  <w:style w:type="paragraph" w:styleId="a7">
     <w:name w:val="footer"/>
     <w:basedOn w:val="a"/>
-    <w:link w:val="a7"/>
+    <w:link w:val="a8"/>
     <w:uiPriority w:val="99"/>
     <w:unhideWhenUsed/>
     <w:rsid w:val="009F185D"/>
@@ -17404,14 +18823,14 @@
       <w:spacing w:after="0" w:line="240" w:lineRule="auto"/>
     </w:pPr>
   </w:style>
-  <w:style w:type="character" w:customStyle="1" w:styleId="a7">
+  <w:style w:type="character" w:customStyle="1" w:styleId="a8">
     <w:name w:val="Нижний колонтитул Знак"/>
     <w:basedOn w:val="a0"/>
-    <w:link w:val="a6"/>
+    <w:link w:val="a7"/>
     <w:uiPriority w:val="99"/>
     <w:rsid w:val="009F185D"/>
   </w:style>
-  <w:style w:type="paragraph" w:styleId="a8">
+  <w:style w:type="paragraph" w:styleId="a9">
     <w:name w:val="List Paragraph"/>
     <w:basedOn w:val="a"/>
     <w:uiPriority w:val="34"/>
@@ -17422,10 +18841,10 @@
       <w:contextualSpacing/>
     </w:pPr>
   </w:style>
-  <w:style w:type="paragraph" w:styleId="a9">
+  <w:style w:type="paragraph" w:styleId="aa">
     <w:name w:val="Balloon Text"/>
     <w:basedOn w:val="a"/>
-    <w:link w:val="aa"/>
+    <w:link w:val="ab"/>
     <w:uiPriority w:val="99"/>
     <w:semiHidden/>
     <w:unhideWhenUsed/>
@@ -17439,10 +18858,10 @@
       <w:szCs w:val="16"/>
     </w:rPr>
   </w:style>
-  <w:style w:type="character" w:customStyle="1" w:styleId="aa">
+  <w:style w:type="character" w:customStyle="1" w:styleId="ab">
     <w:name w:val="Текст выноски Знак"/>
     <w:basedOn w:val="a0"/>
-    <w:link w:val="a9"/>
+    <w:link w:val="aa"/>
     <w:uiPriority w:val="99"/>
     <w:semiHidden/>
     <w:rsid w:val="009F185D"/>
@@ -17455,7 +18874,7 @@
   <w:style w:type="table" w:customStyle="1" w:styleId="1">
     <w:name w:val="Сетка таблицы1"/>
     <w:basedOn w:val="a1"/>
-    <w:next w:val="ab"/>
+    <w:next w:val="ac"/>
     <w:uiPriority w:val="59"/>
     <w:rsid w:val="00C710E0"/>
     <w:pPr>
@@ -17483,7 +18902,7 @@
       </w:tblCellMar>
     </w:tblPr>
   </w:style>
-  <w:style w:type="table" w:styleId="ab">
+  <w:style w:type="table" w:styleId="ac">
     <w:name w:val="Table Grid"/>
     <w:basedOn w:val="a1"/>
     <w:uiPriority w:val="59"/>
@@ -17623,7 +19042,7 @@
       <w:szCs w:val="26"/>
     </w:rPr>
   </w:style>
-  <w:style w:type="character" w:styleId="ac">
+  <w:style w:type="character" w:styleId="ad">
     <w:name w:val="Hyperlink"/>
     <w:basedOn w:val="a0"/>
     <w:uiPriority w:val="99"/>
@@ -17633,6 +19052,51 @@
     <w:rPr>
       <w:color w:val="0000FF"/>
       <w:u w:val="single"/>
+    </w:rPr>
+  </w:style>
+  <w:style w:type="paragraph" w:customStyle="1" w:styleId="ae">
+    <w:name w:val="Лаба"/>
+    <w:basedOn w:val="a3"/>
+    <w:link w:val="af"/>
+    <w:qFormat/>
+    <w:rsid w:val="00A76203"/>
+    <w:pPr>
+      <w:tabs>
+        <w:tab w:val="left" w:pos="993"/>
+      </w:tabs>
+      <w:spacing w:before="0" w:beforeAutospacing="0" w:after="0" w:afterAutospacing="0"/>
+      <w:ind w:firstLine="709"/>
+      <w:jc w:val="both"/>
+    </w:pPr>
+    <w:rPr>
+      <w:sz w:val="28"/>
+      <w:szCs w:val="28"/>
+      <w:lang w:val="uk-UA"/>
+    </w:rPr>
+  </w:style>
+  <w:style w:type="character" w:customStyle="1" w:styleId="a4">
+    <w:name w:val="Обычный (веб) Знак"/>
+    <w:basedOn w:val="a0"/>
+    <w:link w:val="a3"/>
+    <w:uiPriority w:val="99"/>
+    <w:rsid w:val="00A76203"/>
+    <w:rPr>
+      <w:rFonts w:ascii="Times New Roman" w:eastAsia="Times New Roman" w:hAnsi="Times New Roman" w:cs="Times New Roman"/>
+      <w:sz w:val="24"/>
+      <w:szCs w:val="24"/>
+      <w:lang w:eastAsia="ru-RU"/>
+    </w:rPr>
+  </w:style>
+  <w:style w:type="character" w:customStyle="1" w:styleId="af">
+    <w:name w:val="Лаба Знак"/>
+    <w:basedOn w:val="a4"/>
+    <w:link w:val="ae"/>
+    <w:rsid w:val="00A76203"/>
+    <w:rPr>
+      <w:rFonts w:ascii="Times New Roman" w:eastAsia="Times New Roman" w:hAnsi="Times New Roman" w:cs="Times New Roman"/>
+      <w:sz w:val="28"/>
+      <w:szCs w:val="28"/>
+      <w:lang w:val="uk-UA" w:eastAsia="ru-RU"/>
     </w:rPr>
   </w:style>
 </w:styles>
@@ -17846,7 +19310,6 @@
   <w:style w:type="character" w:default="1" w:styleId="a0">
     <w:name w:val="Default Paragraph Font"/>
     <w:uiPriority w:val="1"/>
-    <w:semiHidden/>
     <w:unhideWhenUsed/>
   </w:style>
   <w:style w:type="table" w:default="1" w:styleId="a1">
@@ -17873,6 +19336,7 @@
   <w:style w:type="paragraph" w:styleId="a3">
     <w:name w:val="Normal (Web)"/>
     <w:basedOn w:val="a"/>
+    <w:link w:val="a4"/>
     <w:uiPriority w:val="99"/>
     <w:unhideWhenUsed/>
     <w:rsid w:val="007566DD"/>
@@ -17886,10 +19350,10 @@
       <w:lang w:eastAsia="ru-RU"/>
     </w:rPr>
   </w:style>
-  <w:style w:type="paragraph" w:styleId="a4">
+  <w:style w:type="paragraph" w:styleId="a5">
     <w:name w:val="header"/>
     <w:basedOn w:val="a"/>
-    <w:link w:val="a5"/>
+    <w:link w:val="a6"/>
     <w:uiPriority w:val="99"/>
     <w:unhideWhenUsed/>
     <w:rsid w:val="009F185D"/>
@@ -17901,17 +19365,17 @@
       <w:spacing w:after="0" w:line="240" w:lineRule="auto"/>
     </w:pPr>
   </w:style>
-  <w:style w:type="character" w:customStyle="1" w:styleId="a5">
+  <w:style w:type="character" w:customStyle="1" w:styleId="a6">
     <w:name w:val="Верхний колонтитул Знак"/>
     <w:basedOn w:val="a0"/>
-    <w:link w:val="a4"/>
+    <w:link w:val="a5"/>
     <w:uiPriority w:val="99"/>
     <w:rsid w:val="009F185D"/>
   </w:style>
-  <w:style w:type="paragraph" w:styleId="a6">
+  <w:style w:type="paragraph" w:styleId="a7">
     <w:name w:val="footer"/>
     <w:basedOn w:val="a"/>
-    <w:link w:val="a7"/>
+    <w:link w:val="a8"/>
     <w:uiPriority w:val="99"/>
     <w:unhideWhenUsed/>
     <w:rsid w:val="009F185D"/>
@@ -17923,14 +19387,14 @@
       <w:spacing w:after="0" w:line="240" w:lineRule="auto"/>
     </w:pPr>
   </w:style>
-  <w:style w:type="character" w:customStyle="1" w:styleId="a7">
+  <w:style w:type="character" w:customStyle="1" w:styleId="a8">
     <w:name w:val="Нижний колонтитул Знак"/>
     <w:basedOn w:val="a0"/>
-    <w:link w:val="a6"/>
+    <w:link w:val="a7"/>
     <w:uiPriority w:val="99"/>
     <w:rsid w:val="009F185D"/>
   </w:style>
-  <w:style w:type="paragraph" w:styleId="a8">
+  <w:style w:type="paragraph" w:styleId="a9">
     <w:name w:val="List Paragraph"/>
     <w:basedOn w:val="a"/>
     <w:uiPriority w:val="34"/>
@@ -17941,10 +19405,10 @@
       <w:contextualSpacing/>
     </w:pPr>
   </w:style>
-  <w:style w:type="paragraph" w:styleId="a9">
+  <w:style w:type="paragraph" w:styleId="aa">
     <w:name w:val="Balloon Text"/>
     <w:basedOn w:val="a"/>
-    <w:link w:val="aa"/>
+    <w:link w:val="ab"/>
     <w:uiPriority w:val="99"/>
     <w:semiHidden/>
     <w:unhideWhenUsed/>
@@ -17958,10 +19422,10 @@
       <w:szCs w:val="16"/>
     </w:rPr>
   </w:style>
-  <w:style w:type="character" w:customStyle="1" w:styleId="aa">
+  <w:style w:type="character" w:customStyle="1" w:styleId="ab">
     <w:name w:val="Текст выноски Знак"/>
     <w:basedOn w:val="a0"/>
-    <w:link w:val="a9"/>
+    <w:link w:val="aa"/>
     <w:uiPriority w:val="99"/>
     <w:semiHidden/>
     <w:rsid w:val="009F185D"/>
@@ -17974,7 +19438,7 @@
   <w:style w:type="table" w:customStyle="1" w:styleId="1">
     <w:name w:val="Сетка таблицы1"/>
     <w:basedOn w:val="a1"/>
-    <w:next w:val="ab"/>
+    <w:next w:val="ac"/>
     <w:uiPriority w:val="59"/>
     <w:rsid w:val="00C710E0"/>
     <w:pPr>
@@ -18002,7 +19466,7 @@
       </w:tblCellMar>
     </w:tblPr>
   </w:style>
-  <w:style w:type="table" w:styleId="ab">
+  <w:style w:type="table" w:styleId="ac">
     <w:name w:val="Table Grid"/>
     <w:basedOn w:val="a1"/>
     <w:uiPriority w:val="59"/>
@@ -18142,7 +19606,7 @@
       <w:szCs w:val="26"/>
     </w:rPr>
   </w:style>
-  <w:style w:type="character" w:styleId="ac">
+  <w:style w:type="character" w:styleId="ad">
     <w:name w:val="Hyperlink"/>
     <w:basedOn w:val="a0"/>
     <w:uiPriority w:val="99"/>
@@ -18152,6 +19616,51 @@
     <w:rPr>
       <w:color w:val="0000FF"/>
       <w:u w:val="single"/>
+    </w:rPr>
+  </w:style>
+  <w:style w:type="paragraph" w:customStyle="1" w:styleId="ae">
+    <w:name w:val="Лаба"/>
+    <w:basedOn w:val="a3"/>
+    <w:link w:val="af"/>
+    <w:qFormat/>
+    <w:rsid w:val="00A76203"/>
+    <w:pPr>
+      <w:tabs>
+        <w:tab w:val="left" w:pos="993"/>
+      </w:tabs>
+      <w:spacing w:before="0" w:beforeAutospacing="0" w:after="0" w:afterAutospacing="0"/>
+      <w:ind w:firstLine="709"/>
+      <w:jc w:val="both"/>
+    </w:pPr>
+    <w:rPr>
+      <w:sz w:val="28"/>
+      <w:szCs w:val="28"/>
+      <w:lang w:val="uk-UA"/>
+    </w:rPr>
+  </w:style>
+  <w:style w:type="character" w:customStyle="1" w:styleId="a4">
+    <w:name w:val="Обычный (веб) Знак"/>
+    <w:basedOn w:val="a0"/>
+    <w:link w:val="a3"/>
+    <w:uiPriority w:val="99"/>
+    <w:rsid w:val="00A76203"/>
+    <w:rPr>
+      <w:rFonts w:ascii="Times New Roman" w:eastAsia="Times New Roman" w:hAnsi="Times New Roman" w:cs="Times New Roman"/>
+      <w:sz w:val="24"/>
+      <w:szCs w:val="24"/>
+      <w:lang w:eastAsia="ru-RU"/>
+    </w:rPr>
+  </w:style>
+  <w:style w:type="character" w:customStyle="1" w:styleId="af">
+    <w:name w:val="Лаба Знак"/>
+    <w:basedOn w:val="a4"/>
+    <w:link w:val="ae"/>
+    <w:rsid w:val="00A76203"/>
+    <w:rPr>
+      <w:rFonts w:ascii="Times New Roman" w:eastAsia="Times New Roman" w:hAnsi="Times New Roman" w:cs="Times New Roman"/>
+      <w:sz w:val="28"/>
+      <w:szCs w:val="28"/>
+      <w:lang w:val="uk-UA" w:eastAsia="ru-RU"/>
     </w:rPr>
   </w:style>
 </w:styles>

</xml_diff>